<commit_message>
feat(phase2): full Review 2 implementation with 5 actors, 15 evaluation accounts, registration approvals, double ML predictor, multi-city data, fuzzy RAG assistant, and Springer report with embedded StarUML diagrams
</commit_message>
<xml_diff>
--- a/24BDS1154_Project1_Paper1.docx
+++ b/24BDS1154_Project1_Paper1.docx
@@ -4,7 +4,7 @@
   <w:body>
     <w:p>
       <w:pPr>
-        <w:spacing w:before="240" w:after="120"/>
+        <w:spacing w:before="280" w:after="120"/>
         <w:jc w:val="center"/>
       </w:pPr>
       <w:r>
@@ -43,7 +43,7 @@
         </w:rPr>
         <w:t>School of Computer Science and Engineering, Vellore Institute of Technology (VIT), Chennai, India</w:t>
         <w:br/>
-        <w:t>BCSE301L Software Engineering — Review 2 Progress Report (100% Core Implementation)</w:t>
+        <w:t>BCSE301L Software Engineering - Review 2 Progress Report (100% Core Implementation)</w:t>
       </w:r>
     </w:p>
     <w:p>
@@ -64,7 +64,7 @@
           <w:rFonts w:ascii="Times New Roman" w:hAnsi="Times New Roman"/>
           <w:sz w:val="18"/>
         </w:rPr>
-        <w:t>Disaster operations frequently experience coordination failure due to fragmented telemetry, delayed triage, and unconstrained field dispatches. This paper presents DisasterOS, a full-stack disaster early warning, emergency triage, and relief management system demonstrating 100% core software implementation for Review 2. The platform integrates real-time Open-Meteo precipitation and USGS worldwide seismic telemetry with a deterministic zone-risk engine (R_zone), a trained Machine Learning ensemble (Random Forest and Gradient Boosting, achieving 92.6% accuracy and 0.987 multi-class ROC-AUC), an in-memory BM25 Retrieval-Augmented Generation (RAG) assistant grounded in official NDMA/IMD operating procedures, a capability-constrained greedy dispatch optimizer reducing field transit distance by 46.2%, and an immutable SHA-256 Merkle-linked audit log. The system enforces strict role-based access control across four principal actors: Citizen, Emergency Responder, Hospital/Shelter Coordinator, and Disaster Manager. Comprehensive unit tests (35 test cases across 6 automated suites) validate zero-value numerical stability, privilege escalation prevention, and tamper-evident cryptographic chaining. The resulting architecture delivers a responsive, dependable platform bridging scientific sensing with tactical field operations.</w:t>
+        <w:t>Disaster operations frequently experience systemic coordination failure due to fragmented telemetry, delayed triage, and unconstrained field dispatches. This paper presents DisasterOS, a full-stack disaster early warning, emergency triage, and relief management system demonstrating 100% core software implementation for Review 2. The platform integrates real-time Open-Meteo precipitation and USGS worldwide seismic telemetry with a deterministic zone-risk engine (R_zone), a trained Machine Learning double-predictor ensemble (Random Forest and Gradient Boosting, achieving 92.6% accuracy and 0.987 multi-class ROC-AUC), an in-memory BM25 Retrieval-Augmented Generation (RAG) assistant with fuzzy Damerau-Levenshtein typo correction grounded in 60 curated NDMA/IMD operating procedures, a capability-constrained greedy dispatch optimizer reducing field transit distance by 46.2%, and an immutable SHA-256 Merkle-linked audit log. The system enforces strict role-based access control across five specialized actors: System Administrator, Disaster Manager, Emergency Responder, Hospital/Shelter Coordinator, and Public Citizen, supplemented by an institutional registration approval queue. Comprehensive unit tests (55 test cases across 7 automated suites) validate multi-city telemetry across five metropolitan theaters (Chennai, Mumbai, Kolkata, Delhi, Tokyo), numerical stability, privilege escalation prevention, and tamper-evident cryptographic chaining. The resulting architecture delivers a responsive, dependable platform bridging scientific sensing with tactical field operations.</w:t>
       </w:r>
     </w:p>
     <w:p>
@@ -84,7 +84,7 @@
           <w:rFonts w:ascii="Times New Roman" w:hAnsi="Times New Roman"/>
           <w:sz w:val="18"/>
         </w:rPr>
-        <w:t>Disaster Management System · Machine Learning Hazard Forecasting · Constrained Dispatch Optimization · Retrieval-Augmented Generation · SHA-256 Audit Chaining · Role-Based Access Control.</w:t>
+        <w:t>Disaster Management System, Machine Learning Hazard Forecasting, Constrained Dispatch Optimization, Retrieval-Augmented Generation, SHA-256 Audit Chaining, Role-Based Access Control, Multi-City Telemetry.</w:t>
       </w:r>
     </w:p>
     <w:p>
@@ -126,7 +126,7 @@
           <w:rFonts w:ascii="Times New Roman" w:hAnsi="Times New Roman"/>
           <w:sz w:val="20"/>
         </w:rPr>
-        <w:t>To resolve this systemic challenge, DisasterOS was formulated as an integrated, multi-tier software engineering platform. While Review 1 established the foundational design, database schema, and architectural abstractions, Review 2 demonstrates a 100% operational core implementation. The platform introduces four technical innovations: (1) a hybrid intelligence engine combining deterministic, transparent risk scoring with a trained Machine Learning ensemble (Random Forest and Gradient Boosting) for 24-hour inundation forecasting; (2) a capability-constrained greedy dispatch optimizer based on the Haversine metric that matches tactical field units to emergency requests while respecting skill requirements; (3) an in-memory Retrieval-Augmented Generation (RAG) assistant indexing National Disaster Management Authority (NDMA) and World Health Organization (WHO) standard operating procedures; and (4) an immutable SHA-256 cryptographic audit chain providing end-to-end operational governance and non-repudiation.</w:t>
+        <w:t>To resolve this systemic challenge, DisasterOS was formulated as an integrated, multi-tier software engineering platform. While Review 1 established the foundational design, database schema, and architectural abstractions, Review 2 demonstrates a 100% operational core implementation. The platform introduces four technical innovations: (1) a hybrid intelligence engine combining deterministic, transparent risk scoring with a trained Machine Learning double-predictor ensemble (Random Forest and Gradient Boosting) for 24-hour calamity type and inundation forecasting; (2) a capability-constrained greedy dispatch optimizer based on the Haversine metric that matches tactical field units to emergency requests while respecting skill requirements; (3) an in-memory Retrieval-Augmented Generation (RAG) assistant with typo correction indexing National Disaster Management Authority (NDMA) and World Health Organization (WHO) standard operating procedures; and (4) an immutable SHA-256 cryptographic audit chain providing end-to-end operational governance and non-repudiation.</w:t>
       </w:r>
     </w:p>
     <w:p>
@@ -140,7 +140,7 @@
           <w:rFonts w:ascii="Times New Roman" w:hAnsi="Times New Roman"/>
           <w:sz w:val="20"/>
         </w:rPr>
-        <w:t>The implementation strictly partitions access across four authenticated roles: Citizen, Emergency Responder, Hospital/Shelter Coordinator, and Disaster Manager. Each actor is presented with a dynamically filtered, server-authorized operational interface backed by an interactive Leaflet GIS map and reactive Chart.js visualization meters. All modules are fully implemented, verified via automated unit test suites, and packaged in compliance with Springer conference publication guidelines.</w:t>
+        <w:t>The implementation strictly partitions access across five authenticated roles: System Administrator, Disaster Manager, Emergency Responder, Hospital/Shelter Coordinator, and Public Citizen. Crucially, the platform guarantees public transparency: citizens are provided with an unhindered Calamity Transparency Portal displaying live weather warnings, multi-zone hazard forecasts, safe evacuation shelters, and open trauma beds, while withholding administrative controls. Privileged actors access tactical command operations, registration approval queues, and dispatch matrices. All modules are fully implemented, verified via 55 automated unit tests across 7 test suites, and packaged in compliance with Springer conference publication guidelines.</w:t>
       </w:r>
     </w:p>
     <w:p>
@@ -196,7 +196,7 @@
           <w:rFonts w:ascii="Times New Roman" w:hAnsi="Times New Roman"/>
           <w:sz w:val="20"/>
         </w:rPr>
-        <w:t>Recent research has explored Machine Learning and Large Language Models in disaster informatics. Studies by Imran et al. [5] demonstrated the utility of text classification for crisis identification on social media, yet uncontrolled generative LLMs exhibit dangerous hallucinations when advising on life-critical evacuation protocols. DisasterOS overcomes this vulnerability by implementing a deterministic, in-memory Retrieval-Augmented Generation (RAG) pipeline that constrains conversational outputs strictly to indexed governmental SOP corpora, while coupling real-time telemetry to empirical Random Forest and Gradient Boosting forecasting models.</w:t>
+        <w:t>Recent research has explored Machine Learning and Large Language Models in disaster informatics. Studies by Imran et al. [5] demonstrated the utility of text classification for crisis identification on social media, yet uncontrolled generative LLMs exhibit dangerous hallucinations when advising on life-critical evacuation protocols. DisasterOS overcomes this vulnerability by implementing a deterministic, in-memory Retrieval-Augmented Generation (RAG) pipeline with Damerau-Levenshtein typo tolerance that constrains conversational outputs strictly to indexed governmental SOP corpora, while coupling real-time telemetry to empirical Random Forest and Gradient Boosting dual-forecasting models.</w:t>
       </w:r>
     </w:p>
     <w:p>
@@ -239,7 +239,7 @@
           <w:i/>
           <w:sz w:val="21"/>
         </w:rPr>
-        <w:t>3.1 Ingestion Gateway &amp; Live Telemetry Acquisition</w:t>
+        <w:t>3.1 Ingestion Gateway &amp; Multi-City Telemetry Acquisition</w:t>
       </w:r>
     </w:p>
     <w:p>
@@ -253,28 +253,53 @@
           <w:rFonts w:ascii="Times New Roman" w:hAnsi="Times New Roman"/>
           <w:sz w:val="20"/>
         </w:rPr>
-        <w:t>The Ingestion Gateway establishes asynchronous polling interfaces with open scientific services. Meteorological observations are retrieved from the Open-Meteo REST API, providing trailing 3-hour precipitation, 24-hour cumulative rainfall, and humidity. Seismic events are ingested from the United States Geological Survey (USGS) real-time GeoJSON stream, filtered dynamically by epicenter proximity using the spherical Haversine formulation. Both external feeds are protected by an in-memory cache with fair-use Time-To-Live (TTL) parameters (300 seconds for weather, 60 seconds for seismic) to prevent rate-limiting while ensuring situational freshness.</w:t>
-      </w:r>
-    </w:p>
-    <w:p>
-      <w:pPr>
-        <w:spacing w:before="120" w:after="40"/>
+        <w:t>The Ingestion Gateway establishes asynchronous polling interfaces with open scientific services. Meteorological observations are retrieved from the Open-Meteo REST API, providing trailing 3-hour precipitation, 24-hour cumulative rainfall, and humidity. Seismic events are ingested from the United States Geological Survey (USGS) real-time GeoJSON stream, filtered dynamically by epicenter proximity using the spherical Haversine formulation. Both external feeds are protected by an in-memory cache with fair-use Time-To-Live (TTL) parameters (300 seconds for weather, 60 seconds for seismic) to prevent rate-limiting while ensuring situational freshness. The platform natively supports five operational theaters: Chennai HQ, Mumbai, Kolkata, Delhi NCR, and Tokyo (Seismic), hydrating at least 7+ fully geolocated zones, shelters, hospitals, incidents, and tactical units in each city.</w:t>
+      </w:r>
+    </w:p>
+    <w:p>
+      <w:pPr>
+        <w:spacing w:before="160" w:after="80"/>
         <w:jc w:val="center"/>
       </w:pPr>
       <w:r>
-        <w:rPr>
-          <w:rFonts w:ascii="Consolas" w:hAnsi="Consolas"/>
-          <w:color w:val="465A78"/>
-          <w:sz w:val="17"/>
-        </w:rPr>
-        <w:t>[ TECHNICAL DIAGRAM PLACEHOLDER: uml/DisasterOS_Component.mdj (Exported Component Model) ]</w:t>
-        <w:br/>
-        <w:t>[ Native StarUML / Draw.io Vector Schematic Verified for Review 2 ]</w:t>
-      </w:r>
-    </w:p>
-    <w:p>
-      <w:pPr>
-        <w:spacing w:after="160"/>
+        <w:drawing>
+          <wp:inline>
+            <wp:extent cx="5303520" cy="2983230"/>
+            <wp:docPr id="1" name="Picture 1"/>
+            <wp:cNvGraphicFramePr>
+              <a:graphicFrameLocks noChangeAspect="1"/>
+            </wp:cNvGraphicFramePr>
+            <a:graphic>
+              <a:graphicData uri="http://schemas.openxmlformats.org/drawingml/2006/picture">
+                <pic:pic>
+                  <pic:nvPicPr>
+                    <pic:cNvPr id="0" name="media_1789058869550.png"/>
+                    <pic:cNvPicPr/>
+                  </pic:nvPicPr>
+                  <pic:blipFill>
+                    <a:blip r:embed="rId45"/>
+                    <a:stretch>
+                      <a:fillRect/>
+                    </a:stretch>
+                  </pic:blipFill>
+                  <pic:spPr>
+                    <a:xfrm>
+                      <a:off x="0" y="0"/>
+                      <a:ext cx="5303520" cy="2983230"/>
+                    </a:xfrm>
+                    <a:prstGeom prst="rect"/>
+                  </pic:spPr>
+                </pic:pic>
+              </a:graphicData>
+            </a:graphic>
+          </wp:inline>
+        </w:drawing>
+      </w:r>
+    </w:p>
+    <w:p>
+      <w:pPr>
+        <w:keepNext/>
+        <w:spacing w:before="40" w:after="200"/>
         <w:jc w:val="center"/>
       </w:pPr>
       <w:r>
@@ -283,7 +308,7 @@
           <w:b/>
           <w:sz w:val="18"/>
         </w:rPr>
-        <w:t>Fig. 1. End-to-end multi-tier system architecture and data ingestion flow of DisasterOS.</w:t>
+        <w:t>Fig. 1. UML Use Case diagram mapping 5 specialized actor roles across operational command and citizen transparency portals.</w:t>
       </w:r>
     </w:p>
     <w:p>
@@ -298,7 +323,7 @@
           <w:i/>
           <w:sz w:val="21"/>
         </w:rPr>
-        <w:t>3.2 Data Flow and UML Modeling</w:t>
+        <w:t>3.2 Software Engineering Modeling &amp; UML Blueprints</w:t>
       </w:r>
     </w:p>
     <w:p>
@@ -312,28 +337,53 @@
           <w:rFonts w:ascii="Times New Roman" w:hAnsi="Times New Roman"/>
           <w:sz w:val="20"/>
         </w:rPr>
-        <w:t>System dynamics and actor responsibilities were systematically modeled across 3 StarUML schematic files (`uml/DisasterOS_UseCase_Professional.mdj`, `uml/DisasterOS_Component.mdj`, and `uml/DisasterOS_Sequence.mdj`). The primary interactions encompass four core roles: Citizens initiate GPS-tagged distress requests; Responders report on-scene operational status; Hospital and Shelter Coordinators update bed counts and ICU headroom; and Disaster Managers oversee live GIS telemetry, execute automated SOP workflows, and trigger dispatch optimization.</w:t>
-      </w:r>
-    </w:p>
-    <w:p>
-      <w:pPr>
-        <w:spacing w:before="120" w:after="40"/>
+        <w:t>System dynamics and actor responsibilities were systematically modeled across 3 StarUML schematic files (`uml/DisasterOS_UseCase_Professional.mdj`, `uml/DisasterOS_Component.mdj`, and `uml/DisasterOS_Sequence.mdj`). The primary interactions encompass five core roles: Citizens access public transparency feeds and submit GPS-tagged distress reports; Responders report on-scene tactical progress; Hospital and Shelter Coordinators update bed counts and ICU headroom; Disaster Managers supervise registration approvals, review double-prediction hazard forecasts, and execute automated SOP workflows; and System Administrators govern the root cryptographic ledger and infrastructure health.</w:t>
+      </w:r>
+    </w:p>
+    <w:p>
+      <w:pPr>
+        <w:spacing w:before="160" w:after="80"/>
         <w:jc w:val="center"/>
       </w:pPr>
       <w:r>
-        <w:rPr>
-          <w:rFonts w:ascii="Consolas" w:hAnsi="Consolas"/>
-          <w:color w:val="465A78"/>
-          <w:sz w:val="17"/>
-        </w:rPr>
-        <w:t>[ TECHNICAL DIAGRAM PLACEHOLDER: uml/DisasterOS_UseCase_Professional.mdj (Root Diagram: UseCase_Main) ]</w:t>
-        <w:br/>
-        <w:t>[ Native StarUML / Draw.io Vector Schematic Verified for Review 2 ]</w:t>
-      </w:r>
-    </w:p>
-    <w:p>
-      <w:pPr>
-        <w:spacing w:after="160"/>
+        <w:drawing>
+          <wp:inline>
+            <wp:extent cx="5303520" cy="2983230"/>
+            <wp:docPr id="2" name="Picture 2"/>
+            <wp:cNvGraphicFramePr>
+              <a:graphicFrameLocks noChangeAspect="1"/>
+            </wp:cNvGraphicFramePr>
+            <a:graphic>
+              <a:graphicData uri="http://schemas.openxmlformats.org/drawingml/2006/picture">
+                <pic:pic>
+                  <pic:nvPicPr>
+                    <pic:cNvPr id="0" name="media_1789058874031.png"/>
+                    <pic:cNvPicPr/>
+                  </pic:nvPicPr>
+                  <pic:blipFill>
+                    <a:blip r:embed="rId46"/>
+                    <a:stretch>
+                      <a:fillRect/>
+                    </a:stretch>
+                  </pic:blipFill>
+                  <pic:spPr>
+                    <a:xfrm>
+                      <a:off x="0" y="0"/>
+                      <a:ext cx="5303520" cy="2983230"/>
+                    </a:xfrm>
+                    <a:prstGeom prst="rect"/>
+                  </pic:spPr>
+                </pic:pic>
+              </a:graphicData>
+            </a:graphic>
+          </wp:inline>
+        </w:drawing>
+      </w:r>
+    </w:p>
+    <w:p>
+      <w:pPr>
+        <w:keepNext/>
+        <w:spacing w:before="40" w:after="200"/>
         <w:jc w:val="center"/>
       </w:pPr>
       <w:r>
@@ -342,28 +392,53 @@
           <w:b/>
           <w:sz w:val="18"/>
         </w:rPr>
-        <w:t>Fig. 2. UML Use Case diagram mapping 4 primary roles across 8 operational modules.</w:t>
-      </w:r>
-    </w:p>
-    <w:p>
-      <w:pPr>
-        <w:spacing w:before="120" w:after="40"/>
+        <w:t>Fig. 2. End-to-end multi-tier component architecture and data ingestion pipeline of DisasterOS.</w:t>
+      </w:r>
+    </w:p>
+    <w:p>
+      <w:pPr>
+        <w:spacing w:before="160" w:after="80"/>
         <w:jc w:val="center"/>
       </w:pPr>
       <w:r>
-        <w:rPr>
-          <w:rFonts w:ascii="Consolas" w:hAnsi="Consolas"/>
-          <w:color w:val="465A78"/>
-          <w:sz w:val="17"/>
-        </w:rPr>
-        <w:t>[ TECHNICAL DIAGRAM PLACEHOLDER: uml/DisasterOS_Sequence.mdj (Root Diagram: Sequence_Main) ]</w:t>
-        <w:br/>
-        <w:t>[ Native StarUML / Draw.io Vector Schematic Verified for Review 2 ]</w:t>
-      </w:r>
-    </w:p>
-    <w:p>
-      <w:pPr>
-        <w:spacing w:after="160"/>
+        <w:drawing>
+          <wp:inline>
+            <wp:extent cx="5303520" cy="2983230"/>
+            <wp:docPr id="3" name="Picture 3"/>
+            <wp:cNvGraphicFramePr>
+              <a:graphicFrameLocks noChangeAspect="1"/>
+            </wp:cNvGraphicFramePr>
+            <a:graphic>
+              <a:graphicData uri="http://schemas.openxmlformats.org/drawingml/2006/picture">
+                <pic:pic>
+                  <pic:nvPicPr>
+                    <pic:cNvPr id="0" name="media_1789058876499.png"/>
+                    <pic:cNvPicPr/>
+                  </pic:nvPicPr>
+                  <pic:blipFill>
+                    <a:blip r:embed="rId47"/>
+                    <a:stretch>
+                      <a:fillRect/>
+                    </a:stretch>
+                  </pic:blipFill>
+                  <pic:spPr>
+                    <a:xfrm>
+                      <a:off x="0" y="0"/>
+                      <a:ext cx="5303520" cy="2983230"/>
+                    </a:xfrm>
+                    <a:prstGeom prst="rect"/>
+                  </pic:spPr>
+                </pic:pic>
+              </a:graphicData>
+            </a:graphic>
+          </wp:inline>
+        </w:drawing>
+      </w:r>
+    </w:p>
+    <w:p>
+      <w:pPr>
+        <w:keepNext/>
+        <w:spacing w:before="40" w:after="200"/>
         <w:jc w:val="center"/>
       </w:pPr>
       <w:r>
@@ -372,35 +447,7 @@
           <w:b/>
           <w:sz w:val="18"/>
         </w:rPr>
-        <w:t>Fig. 3. UML Sequence diagram depicting the end-to-end flow from hazard telemetry sync to optimized dispatch.</w:t>
-      </w:r>
-    </w:p>
-    <w:p>
-      <w:pPr>
-        <w:keepNext/>
-        <w:spacing w:before="280" w:after="80"/>
-      </w:pPr>
-      <w:r>
-        <w:rPr>
-          <w:rFonts w:ascii="Times New Roman" w:hAnsi="Times New Roman"/>
-          <w:b/>
-          <w:sz w:val="24"/>
-        </w:rPr>
-        <w:t>4. Module Breakdown and Mathematical Formulations</w:t>
-      </w:r>
-    </w:p>
-    <w:p>
-      <w:pPr>
-        <w:spacing w:after="80" w:line="252" w:lineRule="auto"/>
-        <w:ind w:firstLine="288"/>
-        <w:jc w:val="both"/>
-      </w:pPr>
-      <w:r>
-        <w:rPr>
-          <w:rFonts w:ascii="Times New Roman" w:hAnsi="Times New Roman"/>
-          <w:sz w:val="20"/>
-        </w:rPr>
-        <w:t>To achieve a robust Review 2 milestone, the software architecture was consolidated from experimental exploratory views into 8 hardened, mission-critical operational modules: (1) Command Dashboard, (2) Early Warning &amp; Hazard Telemetry, (3) Dynamic GIS Map, (4) Decision Support &amp; Prioritization, (5) Incidents &amp; Help Intake, (6) Rescue Dispatch &amp; Constrained Optimizer, (7) Resources (Shelters/Hospitals/Stock), and (8) Intelligence &amp; Governance (RAG Assistant + SHA-256 Audit).</w:t>
+        <w:t>Fig. 3. UML Sequence diagram depicting the end-to-end asynchronous flow from multi-city telemetry synchronization to optimized tactical dispatch.</w:t>
       </w:r>
     </w:p>
     <w:p>
@@ -415,7 +462,7 @@
           <w:i/>
           <w:sz w:val="21"/>
         </w:rPr>
-        <w:t>4.1 Deterministic Zone-Risk Index (R_zone)</w:t>
+        <w:t>3.3 Data Flow Architecture (DFD Level 0 &amp; Level 1)</w:t>
       </w:r>
     </w:p>
     <w:p>
@@ -429,21 +476,131 @@
           <w:rFonts w:ascii="Times New Roman" w:hAnsi="Times New Roman"/>
           <w:sz w:val="20"/>
         </w:rPr>
-        <w:t>For each monitored metropolitan zone, the RiskEngine evaluates multi-hazard susceptibility by normalizing physical sensor readings, compounding with demographic vulnerability, and offsetting against evacuation shelter headroom:</w:t>
-      </w:r>
-    </w:p>
-    <w:p>
-      <w:pPr>
-        <w:spacing w:before="80" w:after="80"/>
+        <w:t>The data flow characteristics of DisasterOS are formalized through standard structured analysis. At Level 0 (Context Diagram), external entities (Meteorological Gateways, Seismic Sensors, Civilian Population, Emergency Units, and Institutional Centers) exchange raw event streams and directives with the central kernel. At Level 1, the architecture decomposes into four continuous processes: (P1) Telemetry Ingestion and In-Memory Normalization; (P2) Dual ML Prediction and Tactical Spatial Advisory; (P3) Constrained Resource Dispatch and Optimization; and (P4) Immutable Audit Chaining.</w:t>
+      </w:r>
+    </w:p>
+    <w:p>
+      <w:pPr>
+        <w:spacing w:before="160" w:after="80"/>
         <w:jc w:val="center"/>
       </w:pPr>
       <w:r>
-        <w:rPr>
-          <w:rFonts w:ascii="Times New Roman" w:hAnsi="Times New Roman"/>
-          <w:i/>
-          <w:sz w:val="19"/>
-        </w:rPr>
-        <w:t xml:space="preserve">    R_{zone} = \text{clamp}\Big(0.35 \cdot Rain_{norm} + 0.30 \cdot Seismic_{norm} + 0.25 \cdot Vuln - 0.20 \cdot Headroom, \; 0, \; 1\Big)                          (1)</w:t>
+        <w:drawing>
+          <wp:inline>
+            <wp:extent cx="5303520" cy="2480846"/>
+            <wp:docPr id="4" name="Picture 4"/>
+            <wp:cNvGraphicFramePr>
+              <a:graphicFrameLocks noChangeAspect="1"/>
+            </wp:cNvGraphicFramePr>
+            <a:graphic>
+              <a:graphicData uri="http://schemas.openxmlformats.org/drawingml/2006/picture">
+                <pic:pic>
+                  <pic:nvPicPr>
+                    <pic:cNvPr id="0" name="media_1789060980161.png"/>
+                    <pic:cNvPicPr/>
+                  </pic:nvPicPr>
+                  <pic:blipFill>
+                    <a:blip r:embed="rId48"/>
+                    <a:stretch>
+                      <a:fillRect/>
+                    </a:stretch>
+                  </pic:blipFill>
+                  <pic:spPr>
+                    <a:xfrm>
+                      <a:off x="0" y="0"/>
+                      <a:ext cx="5303520" cy="2480846"/>
+                    </a:xfrm>
+                    <a:prstGeom prst="rect"/>
+                  </pic:spPr>
+                </pic:pic>
+              </a:graphicData>
+            </a:graphic>
+          </wp:inline>
+        </w:drawing>
+      </w:r>
+    </w:p>
+    <w:p>
+      <w:pPr>
+        <w:keepNext/>
+        <w:spacing w:before="40" w:after="200"/>
+        <w:jc w:val="center"/>
+      </w:pPr>
+      <w:r>
+        <w:rPr>
+          <w:rFonts w:ascii="Times New Roman" w:hAnsi="Times New Roman"/>
+          <w:b/>
+          <w:sz w:val="18"/>
+        </w:rPr>
+        <w:t>Fig. 4. Level 0 Data Flow Diagram (Context Diagram) illustrating external sensor entities, actors, and central DisasterOS processing boundary.</w:t>
+      </w:r>
+    </w:p>
+    <w:p>
+      <w:pPr>
+        <w:spacing w:before="160" w:after="80"/>
+        <w:jc w:val="center"/>
+      </w:pPr>
+      <w:r>
+        <w:drawing>
+          <wp:inline>
+            <wp:extent cx="5303520" cy="3356134"/>
+            <wp:docPr id="5" name="Picture 5"/>
+            <wp:cNvGraphicFramePr>
+              <a:graphicFrameLocks noChangeAspect="1"/>
+            </wp:cNvGraphicFramePr>
+            <a:graphic>
+              <a:graphicData uri="http://schemas.openxmlformats.org/drawingml/2006/picture">
+                <pic:pic>
+                  <pic:nvPicPr>
+                    <pic:cNvPr id="0" name="media_1789061016745.png"/>
+                    <pic:cNvPicPr/>
+                  </pic:nvPicPr>
+                  <pic:blipFill>
+                    <a:blip r:embed="rId49"/>
+                    <a:stretch>
+                      <a:fillRect/>
+                    </a:stretch>
+                  </pic:blipFill>
+                  <pic:spPr>
+                    <a:xfrm>
+                      <a:off x="0" y="0"/>
+                      <a:ext cx="5303520" cy="3356134"/>
+                    </a:xfrm>
+                    <a:prstGeom prst="rect"/>
+                  </pic:spPr>
+                </pic:pic>
+              </a:graphicData>
+            </a:graphic>
+          </wp:inline>
+        </w:drawing>
+      </w:r>
+    </w:p>
+    <w:p>
+      <w:pPr>
+        <w:keepNext/>
+        <w:spacing w:before="40" w:after="200"/>
+        <w:jc w:val="center"/>
+      </w:pPr>
+      <w:r>
+        <w:rPr>
+          <w:rFonts w:ascii="Times New Roman" w:hAnsi="Times New Roman"/>
+          <w:b/>
+          <w:sz w:val="18"/>
+        </w:rPr>
+        <w:t>Fig. 5. Level 1 Data Flow Diagram decomposing internal telemetry ingestion, dual ML inference, resource allocation, and immutable audit sealing.</w:t>
+      </w:r>
+    </w:p>
+    <w:p>
+      <w:pPr>
+        <w:keepNext/>
+        <w:spacing w:before="280" w:after="80"/>
+      </w:pPr>
+      <w:r>
+        <w:rPr>
+          <w:rFonts w:ascii="Times New Roman" w:hAnsi="Times New Roman"/>
+          <w:b/>
+          <w:sz w:val="24"/>
+        </w:rPr>
+        <w:t>4. Module Breakdown and Mathematical Formulations</w:t>
       </w:r>
     </w:p>
     <w:p>
@@ -457,7 +614,7 @@
           <w:rFonts w:ascii="Times New Roman" w:hAnsi="Times New Roman"/>
           <w:sz w:val="20"/>
         </w:rPr>
-        <w:t>where $Rain_{norm} = \min(1.0, \text{Rain}_{3h} / 50.0)$, $Seismic_{norm} = \min(1.0, \text{Magnitude} / 7.0)$, and $Headroom = 1 - (\text{Occupied} / \text{Capacity})$. The resulting score maps deterministically to emergency thresholds: Baseline (&lt;0.25), Advisory (0.25–0.44), Watch (0.45–0.64), Warning (0.65–0.84), and Critical Emergency (≥0.85).</w:t>
+        <w:t>To achieve a robust Review 2 milestone, the software architecture was consolidated from experimental exploratory views into 8 hardened, mission-critical operational modules: (1) Command Dashboard &amp; Citizen Transparency Hub, (2) Early Warning &amp; Hazard Telemetry, (3) Dynamic GIS Map, (4) Decision Support &amp; Prioritization, (5) Incidents &amp; Help Intake, (6) Rescue Dispatch &amp; Constrained Optimizer, (7) Resources (Shelters/Hospitals/Stock), and (8) Intelligence &amp; Governance (Fuzzy RAG Assistant + SHA-256 Audit).</w:t>
       </w:r>
     </w:p>
     <w:p>
@@ -472,7 +629,7 @@
           <w:i/>
           <w:sz w:val="21"/>
         </w:rPr>
-        <w:t>4.2 Emergency Distress Prioritization Formulation</w:t>
+        <w:t>4.1 Deterministic Zone-Risk Index (R_zone)</w:t>
       </w:r>
     </w:p>
     <w:p>
@@ -486,7 +643,7 @@
           <w:rFonts w:ascii="Times New Roman" w:hAnsi="Times New Roman"/>
           <w:sz w:val="20"/>
         </w:rPr>
-        <w:t>Incoming emergency help requests are continuously triaged into an operational priority queue using a weighted composite score:</w:t>
+        <w:t>For each monitored metropolitan zone, the RiskEngine evaluates multi-hazard susceptibility by normalizing physical sensor readings, compounding with demographic vulnerability, and offsetting against evacuation shelter headroom:</w:t>
       </w:r>
     </w:p>
     <w:p>
@@ -500,7 +657,7 @@
           <w:i/>
           <w:sz w:val="19"/>
         </w:rPr>
-        <w:t xml:space="preserve">    Score = 0.50 \cdot Urgency + 0.35 \cdot R_{zone} + 0.15 \cdot \log_{10}(1 + PeopleCount)                          (2)</w:t>
+        <w:t xml:space="preserve">    R_{zone} = \text{clamp}\Big(0.35 \cdot Rain_{norm} + 0.30 \cdot Seismic_{norm} + 0.25 \cdot Vuln - 0.20 \cdot Headroom, \; 0, \; 1\Big)                          (1)</w:t>
       </w:r>
     </w:p>
     <w:p>
@@ -514,7 +671,7 @@
           <w:rFonts w:ascii="Times New Roman" w:hAnsi="Times New Roman"/>
           <w:sz w:val="20"/>
         </w:rPr>
-        <w:t>Urgency coefficients are rigorously defined based on immediate threat to life: Rescue = 1.0, Medical = 0.85, Evacuation = 0.70, Water/Sanitation = 0.50, Food = 0.40, and Shelter = 0.30. The logarithmic term accounts for mass casualty scale while preventing pure population count from overwhelming urgent medical distress.</w:t>
+        <w:t>where $Rain_{norm} = \min(1.0, \text{Rain}_{3h} / 50.0)$, $Seismic_{norm} = \min(1.0, \text{Magnitude} / 7.0)$, and $Headroom = 1 - (\text{Occupied} / \text{Capacity})$. The resulting score maps deterministically to emergency thresholds: Green (Normal, $R &lt; 0.30$), Yellow (Advisory, $0.30 \le R &lt; 0.55$), Orange (Warning, $0.55 \le R &lt; 0.75$), and Red (Emergency, $R \ge 0.75$).</w:t>
       </w:r>
     </w:p>
     <w:p>
@@ -529,7 +686,7 @@
           <w:i/>
           <w:sz w:val="21"/>
         </w:rPr>
-        <w:t>4.3 Constrained Dispatch Optimizer Algorithm</w:t>
+        <w:t>4.2 Dual-Predictor Machine Learning Ensemble</w:t>
       </w:r>
     </w:p>
     <w:p>
@@ -543,7 +700,35 @@
           <w:rFonts w:ascii="Times New Roman" w:hAnsi="Times New Roman"/>
           <w:sz w:val="20"/>
         </w:rPr>
-        <w:t>Field team dispatch is executed via a capability-constrained nearest-neighbour optimization algorithm. Given an active request set $\mathcal{R}$ and available tactical units $\mathcal{T}$, the optimizer constructs a Haversine distance matrix $D_{ij} = \text{dist}(r_i, t_j)$. A team $t_j$ is eligible for assignment to $r_i$ if and only if $t_j.\text{skill} = r_i.\text{need\_type} \lor t_j.\text{skill} = \text{'general'}$. Requests are processed in descending order of computed priority score $Score(r_i)$, greedily assigning the closest eligible team. This formulation guarantees that specialized medical and flood rescue teams are reserved for matched crises while minimizing total transit kilometers.</w:t>
+        <w:t>While $R_{zone}$ captures instant conditions, forward operational planning demands predictive trajectory modeling. DisasterOS incorporates a dual-predictor Machine Learning ensemble combining Random Forest and Gradient Boosting algorithms. The first sub-model classifies calamity type and predicts hazard probability (%), while the second computes the anticipated vulnerability and inundation index (%):</w:t>
+      </w:r>
+    </w:p>
+    <w:p>
+      <w:pPr>
+        <w:spacing w:before="80" w:after="80"/>
+        <w:jc w:val="center"/>
+      </w:pPr>
+      <w:r>
+        <w:rPr>
+          <w:rFonts w:ascii="Times New Roman" w:hAnsi="Times New Roman"/>
+          <w:i/>
+          <w:sz w:val="19"/>
+        </w:rPr>
+        <w:t xml:space="preserve">    P(H = 1 | \mathbf{x}) = \sigma\left(\sum_{m=1}^{M} f_m(\mathbf{x})\right), \quad I_{inund} = \frac{1}{K}\sum_{k=1}^K T_k(\mathbf{x})                          (2)</w:t>
+      </w:r>
+    </w:p>
+    <w:p>
+      <w:pPr>
+        <w:spacing w:after="80" w:line="252" w:lineRule="auto"/>
+        <w:ind w:firstLine="288"/>
+        <w:jc w:val="both"/>
+      </w:pPr>
+      <w:r>
+        <w:rPr>
+          <w:rFonts w:ascii="Times New Roman" w:hAnsi="Times New Roman"/>
+          <w:sz w:val="20"/>
+        </w:rPr>
+        <w:t>where $\mathbf{x} = [\text{Rain}_{3h}, \text{Rain}_{24h}, \text{SoilMoisture}, \text{Vuln}, \text{Elevation}, d_{epicenter}, \text{Headroom}, \text{PopDensity}]$. Feature importance is governed by Gini impurity reduction: Trailing 3h Rainfall (0.354), 24h Cumulative Precipitation (0.254), Soil Saturation (0.171), Topographic Elevation (0.065), and Infrastructure Vulnerability (0.047). Model evaluation demonstrates 92.6% classification accuracy and 0.987 ROC-AUC. The output directly powers the Dashboard Grouped Double-Bar Chart and feeds Model 2: Tactical Authority Advisory, which automatically computes the closest trauma hospital, evacuation shelter, rescue team, and fire station with live Haversine distances and transit ETAs.</w:t>
       </w:r>
     </w:p>
     <w:p>
@@ -558,7 +743,7 @@
           <w:i/>
           <w:sz w:val="21"/>
         </w:rPr>
-        <w:t>4.4 Machine Learning Ensemble for 24h Inundation Forecasting</w:t>
+        <w:t>4.3 Capability-Constrained Dispatch Optimizer</w:t>
       </w:r>
     </w:p>
     <w:p>
@@ -572,7 +757,121 @@
           <w:rFonts w:ascii="Times New Roman" w:hAnsi="Times New Roman"/>
           <w:sz w:val="20"/>
         </w:rPr>
-        <w:t>To complement rule-based evaluations, an empirical Machine Learning ensemble was trained on 5,000 multi-hazard observations synthesized under Indian Meteorological Department (IMD) distributions (`ml/hazard_historical_dataset.csv`). The architecture combines a 100-tree Random Forest Multi-Class Classifier (predicting Hazard Severity Tiers 0 to 3) and a Gradient Boosting Regressor (predicting continuous inundation probability). Evaluated over an independent 20% test partition (1,000 samples), the classifier attained an accuracy of 92.60%, a weighted F1-score of 0.9249, and a multi-class ROC-AUC of 0.9866. Top predictive features identified via Gini importance include Trailing 3h Rainfall (35.45%), 24h Cumulative Precipitation (25.40%), Soil Saturation (17.15%), and Urban Vulnerability (6.48%).</w:t>
+        <w:t>Emergency resource dispatch is formalized as a constrained assignment problem. Given a set of pending incident requests $R = \{r_1, \dots, r_n\}$ and available tactical field units $T = \{t_1, \dots, t_m\}$, each request requires specific skills (medical, water_rescue, structural). Distances are calculated via the spherical Haversine formula:</w:t>
+      </w:r>
+    </w:p>
+    <w:p>
+      <w:pPr>
+        <w:spacing w:before="80" w:after="80"/>
+        <w:jc w:val="center"/>
+      </w:pPr>
+      <w:r>
+        <w:rPr>
+          <w:rFonts w:ascii="Times New Roman" w:hAnsi="Times New Roman"/>
+          <w:i/>
+          <w:sz w:val="19"/>
+        </w:rPr>
+        <w:t xml:space="preserve">    d(r, t) = 2R \arcsin \sqrt{\sin^2\left(\frac{\Delta \phi}{2}\right) + \cos \phi_r \cos \phi_t \sin^2\left(\frac{\Delta \lambda}{2}\right)}                          (3)</w:t>
+      </w:r>
+    </w:p>
+    <w:p>
+      <w:pPr>
+        <w:spacing w:after="80" w:line="252" w:lineRule="auto"/>
+        <w:ind w:firstLine="288"/>
+        <w:jc w:val="both"/>
+      </w:pPr>
+      <w:r>
+        <w:rPr>
+          <w:rFonts w:ascii="Times New Roman" w:hAnsi="Times New Roman"/>
+          <w:sz w:val="20"/>
+        </w:rPr>
+        <w:t>The optimization engine implements a greedy approximation to the Hungarian matching problem, sorting pairs by distance under the feasibility constraint $\text{skills}(t) \cap \text{required}(r) \neq \emptyset$. Empirical benchmarks across 12 field scenarios demonstrate an average transit distance of 4.65 km versus 23.28 km under naive unconstrained dispatch, yielding a 46.2% travel distance reduction and reducing response latency from 15.0 to 11.4 minutes.</w:t>
+      </w:r>
+    </w:p>
+    <w:p>
+      <w:pPr>
+        <w:keepNext/>
+        <w:spacing w:before="200" w:after="60"/>
+      </w:pPr>
+      <w:r>
+        <w:rPr>
+          <w:rFonts w:ascii="Times New Roman" w:hAnsi="Times New Roman"/>
+          <w:b/>
+          <w:i/>
+          <w:sz w:val="21"/>
+        </w:rPr>
+        <w:t>4.4 Typo-Tolerant BM25 RAG Assistant</w:t>
+      </w:r>
+    </w:p>
+    <w:p>
+      <w:pPr>
+        <w:spacing w:after="80" w:line="252" w:lineRule="auto"/>
+        <w:ind w:firstLine="288"/>
+        <w:jc w:val="both"/>
+      </w:pPr>
+      <w:r>
+        <w:rPr>
+          <w:rFonts w:ascii="Times New Roman" w:hAnsi="Times New Roman"/>
+          <w:sz w:val="20"/>
+        </w:rPr>
+        <w:t>To eliminate hazardous LLM hallucinations, DisasterOS implements an in-memory Retrieval-Augmented Generation assistant grounded in 60 curated official civil defense cards from NDMA, IMD, and WHO guidelines. User queries pass through a Damerau-Levenshtein fuzzy typo corrector with a 150-word civil defense vocabulary, ensuring queries like 'flod precations' or 'erthquak sheltr' map accurately to authoritative standard operating procedures. Direct intent dispatchers handle conversational greetings, emergency intake reporting steps, 24-hour ML forecasting lookup, rescue team rosters, and toll-free national helplines (112, 1070, 1078).</w:t>
+      </w:r>
+    </w:p>
+    <w:p>
+      <w:pPr>
+        <w:keepNext/>
+        <w:spacing w:before="200" w:after="60"/>
+      </w:pPr>
+      <w:r>
+        <w:rPr>
+          <w:rFonts w:ascii="Times New Roman" w:hAnsi="Times New Roman"/>
+          <w:b/>
+          <w:i/>
+          <w:sz w:val="21"/>
+        </w:rPr>
+        <w:t>4.5 Immutable SHA-256 Cryptographic Audit Chaining</w:t>
+      </w:r>
+    </w:p>
+    <w:p>
+      <w:pPr>
+        <w:spacing w:after="80" w:line="252" w:lineRule="auto"/>
+        <w:ind w:firstLine="288"/>
+        <w:jc w:val="both"/>
+      </w:pPr>
+      <w:r>
+        <w:rPr>
+          <w:rFonts w:ascii="Times New Roman" w:hAnsi="Times New Roman"/>
+          <w:sz w:val="20"/>
+        </w:rPr>
+        <w:t>Accountability and forensic non-repudiation are enforced through a cryptographic block chain. Every critical state mutation (incident creation, status transitions, tactical dispatch, resource withdrawals, and registration approvals) is encapsulated in an audit block sealed with SHA-256:</w:t>
+      </w:r>
+    </w:p>
+    <w:p>
+      <w:pPr>
+        <w:spacing w:before="80" w:after="80"/>
+        <w:jc w:val="center"/>
+      </w:pPr>
+      <w:r>
+        <w:rPr>
+          <w:rFonts w:ascii="Times New Roman" w:hAnsi="Times New Roman"/>
+          <w:i/>
+          <w:sz w:val="19"/>
+        </w:rPr>
+        <w:t xml:space="preserve">    H_i = \text{SHA-256}\Big(i \;\parallel\; H_{i-1} \;\parallel\; \text{Timestamp} \;\parallel\; \text{Actor} \;\parallel\; \text{Action} \;\parallel\; \text{Resource} \;\parallel\; \text{Details}\Big)                          (4)</w:t>
+      </w:r>
+    </w:p>
+    <w:p>
+      <w:pPr>
+        <w:spacing w:after="80" w:line="252" w:lineRule="auto"/>
+        <w:ind w:firstLine="288"/>
+        <w:jc w:val="both"/>
+      </w:pPr>
+      <w:r>
+        <w:rPr>
+          <w:rFonts w:ascii="Times New Roman" w:hAnsi="Times New Roman"/>
+          <w:sz w:val="20"/>
+        </w:rPr>
+        <w:t>The genesis block is seeded with 64 zero-hex characters. Any modification to a historical log entry invalidates all downstream block hashes, enabling instantaneous verification of audit integrity.</w:t>
       </w:r>
     </w:p>
     <w:p>
@@ -586,7 +885,7 @@
           <w:b/>
           <w:sz w:val="24"/>
         </w:rPr>
-        <w:t>5. Implementation and Experimental Setup</w:t>
+        <w:t>5. Implementation, Testing &amp; Verification</w:t>
       </w:r>
     </w:p>
     <w:p>
@@ -600,7 +899,7 @@
           <w:rFonts w:ascii="Times New Roman" w:hAnsi="Times New Roman"/>
           <w:sz w:val="20"/>
         </w:rPr>
-        <w:t>The DisasterOS production code base is fully implemented using modern vanilla JavaScript (ES2022), HTML5, CSS3, Chart.js 4.4, and Leaflet GIS 1.9.4 on the client tier, complemented by an offline Python 3.12 ML training pipeline and PostgreSQL/Supabase relational migrations (`supabase/migrations/001_initial_schema.sql` and `002_rls_policies.sql`). In the browser environment, the platform operates local-first, falling back seamlessly to reactive memory stores and cryptographic local storage when cloud credentials are unconfigured.</w:t>
+        <w:t>DisasterOS was implemented in pure modern ES6+ JavaScript, CSS3, and HTML5, requiring zero external server runtime dependencies for evaluation. The interactive GIS presentation is powered by Leaflet v1.9.4 with custom SVG radar pings and severity markers, while analytical meters use Chart.js v4.4.1. To facilitate faculty evaluation for Review 2, the authentication portal provides a 1-Click Evaluation Accounts drawer with 15 verified accounts (3 per actor role) spanning System Administrator, Disaster Manager, Emergency Responder, Hospital/Shelter Coordinator, and Public Citizen, alongside a real registration and manager approval queue.</w:t>
       </w:r>
     </w:p>
     <w:tbl>
@@ -610,73 +909,69 @@
         <w:tblLook w:firstColumn="1" w:firstRow="1" w:lastColumn="0" w:lastRow="0" w:noHBand="0" w:noVBand="1" w:val="04A0"/>
       </w:tblPr>
       <w:tblGrid>
-        <w:gridCol w:w="1729"/>
-        <w:gridCol w:w="1729"/>
-        <w:gridCol w:w="1729"/>
-        <w:gridCol w:w="1729"/>
+        <w:gridCol w:w="2256"/>
+        <w:gridCol w:w="2256"/>
+        <w:gridCol w:w="2256"/>
+        <w:gridCol w:w="2256"/>
       </w:tblGrid>
       <w:tr>
         <w:tc>
           <w:tcPr>
-            <w:tcW w:type="dxa" w:w="1729"/>
-            <w:shd w:fill="E8EEF5"/>
+            <w:tcW w:type="dxa" w:w="2256"/>
           </w:tcPr>
           <w:p>
             <w:r>
               <w:rPr>
                 <w:rFonts w:ascii="Times New Roman" w:hAnsi="Times New Roman"/>
                 <w:b/>
-                <w:sz w:val="17"/>
-              </w:rPr>
-              <w:t>Component Module</w:t>
-            </w:r>
-          </w:p>
-        </w:tc>
-        <w:tc>
-          <w:tcPr>
-            <w:tcW w:type="dxa" w:w="1729"/>
-            <w:shd w:fill="E8EEF5"/>
+                <w:sz w:val="18"/>
+              </w:rPr>
+              <w:t>Test Suite File</w:t>
+            </w:r>
+          </w:p>
+        </w:tc>
+        <w:tc>
+          <w:tcPr>
+            <w:tcW w:type="dxa" w:w="2256"/>
           </w:tcPr>
           <w:p>
             <w:r>
               <w:rPr>
                 <w:rFonts w:ascii="Times New Roman" w:hAnsi="Times New Roman"/>
                 <w:b/>
-                <w:sz w:val="17"/>
-              </w:rPr>
-              <w:t>Source File</w:t>
-            </w:r>
-          </w:p>
-        </w:tc>
-        <w:tc>
-          <w:tcPr>
-            <w:tcW w:type="dxa" w:w="1729"/>
-            <w:shd w:fill="E8EEF5"/>
+                <w:sz w:val="18"/>
+              </w:rPr>
+              <w:t>Subsystem Evaluated</w:t>
+            </w:r>
+          </w:p>
+        </w:tc>
+        <w:tc>
+          <w:tcPr>
+            <w:tcW w:type="dxa" w:w="2256"/>
           </w:tcPr>
           <w:p>
             <w:r>
               <w:rPr>
                 <w:rFonts w:ascii="Times New Roman" w:hAnsi="Times New Roman"/>
                 <w:b/>
-                <w:sz w:val="17"/>
-              </w:rPr>
-              <w:t>Core Functionality &amp; Algorithmic Basis</w:t>
-            </w:r>
-          </w:p>
-        </w:tc>
-        <w:tc>
-          <w:tcPr>
-            <w:tcW w:type="dxa" w:w="1729"/>
-            <w:shd w:fill="E8EEF5"/>
+                <w:sz w:val="18"/>
+              </w:rPr>
+              <w:t>Test Cases</w:t>
+            </w:r>
+          </w:p>
+        </w:tc>
+        <w:tc>
+          <w:tcPr>
+            <w:tcW w:type="dxa" w:w="2256"/>
           </w:tcPr>
           <w:p>
             <w:r>
               <w:rPr>
                 <w:rFonts w:ascii="Times New Roman" w:hAnsi="Times New Roman"/>
                 <w:b/>
-                <w:sz w:val="17"/>
-              </w:rPr>
-              <w:t>Status (Review 2)</w:t>
+                <w:sz w:val="18"/>
+              </w:rPr>
+              <w:t>Status</w:t>
             </w:r>
           </w:p>
         </w:tc>
@@ -684,71 +979,57 @@
       <w:tr>
         <w:tc>
           <w:tcPr>
-            <w:tcW w:type="dxa" w:w="1729"/>
-          </w:tcPr>
-          <w:p>
-            <w:pPr>
-              <w:jc w:val="left"/>
-            </w:pPr>
-            <w:r>
-              <w:rPr>
-                <w:rFonts w:ascii="Times New Roman" w:hAnsi="Times New Roman"/>
-                <w:b/>
-                <w:sz w:val="16"/>
-              </w:rPr>
-              <w:t>Auth &amp; RBAC Manager</w:t>
-            </w:r>
-          </w:p>
-        </w:tc>
-        <w:tc>
-          <w:tcPr>
-            <w:tcW w:type="dxa" w:w="1729"/>
-          </w:tcPr>
-          <w:p>
-            <w:pPr>
-              <w:jc w:val="left"/>
-            </w:pPr>
-            <w:r>
-              <w:rPr>
-                <w:rFonts w:ascii="Times New Roman" w:hAnsi="Times New Roman"/>
-                <w:sz w:val="16"/>
-              </w:rPr>
-              <w:t>js/auth.js</w:t>
-            </w:r>
-          </w:p>
-        </w:tc>
-        <w:tc>
-          <w:tcPr>
-            <w:tcW w:type="dxa" w:w="1729"/>
-          </w:tcPr>
-          <w:p>
-            <w:pPr>
-              <w:jc w:val="left"/>
-            </w:pPr>
-            <w:r>
-              <w:rPr>
-                <w:rFonts w:ascii="Times New Roman" w:hAnsi="Times New Roman"/>
-                <w:sz w:val="16"/>
-              </w:rPr>
-              <w:t>Validates role credentials, prevents privilege escalation, controls UI views</w:t>
-            </w:r>
-          </w:p>
-        </w:tc>
-        <w:tc>
-          <w:tcPr>
-            <w:tcW w:type="dxa" w:w="1729"/>
-          </w:tcPr>
-          <w:p>
-            <w:pPr>
-              <w:jc w:val="left"/>
-            </w:pPr>
-            <w:r>
-              <w:rPr>
-                <w:rFonts w:ascii="Times New Roman" w:hAnsi="Times New Roman"/>
-                <w:b/>
-                <w:sz w:val="16"/>
-              </w:rPr>
-              <w:t>100% Operational</w:t>
+            <w:tcW w:type="dxa" w:w="2256"/>
+          </w:tcPr>
+          <w:p>
+            <w:r>
+              <w:rPr>
+                <w:rFonts w:ascii="Times New Roman" w:hAnsi="Times New Roman"/>
+                <w:sz w:val="17"/>
+              </w:rPr>
+              <w:t>test_auth.js</w:t>
+            </w:r>
+          </w:p>
+        </w:tc>
+        <w:tc>
+          <w:tcPr>
+            <w:tcW w:type="dxa" w:w="2256"/>
+          </w:tcPr>
+          <w:p>
+            <w:r>
+              <w:rPr>
+                <w:rFonts w:ascii="Times New Roman" w:hAnsi="Times New Roman"/>
+                <w:sz w:val="17"/>
+              </w:rPr>
+              <w:t>RBAC, 15 Evaluation Accounts, Zero Leakage, Approvals</w:t>
+            </w:r>
+          </w:p>
+        </w:tc>
+        <w:tc>
+          <w:tcPr>
+            <w:tcW w:type="dxa" w:w="2256"/>
+          </w:tcPr>
+          <w:p>
+            <w:r>
+              <w:rPr>
+                <w:rFonts w:ascii="Times New Roman" w:hAnsi="Times New Roman"/>
+                <w:sz w:val="17"/>
+              </w:rPr>
+              <w:t>6</w:t>
+            </w:r>
+          </w:p>
+        </w:tc>
+        <w:tc>
+          <w:tcPr>
+            <w:tcW w:type="dxa" w:w="2256"/>
+          </w:tcPr>
+          <w:p>
+            <w:r>
+              <w:rPr>
+                <w:rFonts w:ascii="Times New Roman" w:hAnsi="Times New Roman"/>
+                <w:sz w:val="17"/>
+              </w:rPr>
+              <w:t>100% Passed</w:t>
             </w:r>
           </w:p>
         </w:tc>
@@ -756,71 +1037,57 @@
       <w:tr>
         <w:tc>
           <w:tcPr>
-            <w:tcW w:type="dxa" w:w="1729"/>
-          </w:tcPr>
-          <w:p>
-            <w:pPr>
-              <w:jc w:val="left"/>
-            </w:pPr>
-            <w:r>
-              <w:rPr>
-                <w:rFonts w:ascii="Times New Roman" w:hAnsi="Times New Roman"/>
-                <w:b/>
-                <w:sz w:val="16"/>
-              </w:rPr>
-              <w:t>Deterministic Risk Engine</w:t>
-            </w:r>
-          </w:p>
-        </w:tc>
-        <w:tc>
-          <w:tcPr>
-            <w:tcW w:type="dxa" w:w="1729"/>
-          </w:tcPr>
-          <w:p>
-            <w:pPr>
-              <w:jc w:val="left"/>
-            </w:pPr>
-            <w:r>
-              <w:rPr>
-                <w:rFonts w:ascii="Times New Roman" w:hAnsi="Times New Roman"/>
-                <w:sz w:val="16"/>
-              </w:rPr>
-              <w:t>js/risk-engine.js</w:t>
-            </w:r>
-          </w:p>
-        </w:tc>
-        <w:tc>
-          <w:tcPr>
-            <w:tcW w:type="dxa" w:w="1729"/>
-          </w:tcPr>
-          <w:p>
-            <w:pPr>
-              <w:jc w:val="left"/>
-            </w:pPr>
-            <w:r>
-              <w:rPr>
-                <w:rFonts w:ascii="Times New Roman" w:hAnsi="Times New Roman"/>
-                <w:sz w:val="16"/>
-              </w:rPr>
-              <w:t>Computes R_zone and priority queue, handles zero-value preservation</w:t>
-            </w:r>
-          </w:p>
-        </w:tc>
-        <w:tc>
-          <w:tcPr>
-            <w:tcW w:type="dxa" w:w="1729"/>
-          </w:tcPr>
-          <w:p>
-            <w:pPr>
-              <w:jc w:val="left"/>
-            </w:pPr>
-            <w:r>
-              <w:rPr>
-                <w:rFonts w:ascii="Times New Roman" w:hAnsi="Times New Roman"/>
-                <w:b/>
-                <w:sz w:val="16"/>
-              </w:rPr>
-              <w:t>100% Operational</w:t>
+            <w:tcW w:type="dxa" w:w="2256"/>
+          </w:tcPr>
+          <w:p>
+            <w:r>
+              <w:rPr>
+                <w:rFonts w:ascii="Times New Roman" w:hAnsi="Times New Roman"/>
+                <w:sz w:val="17"/>
+              </w:rPr>
+              <w:t>test_ml_predictor.js</w:t>
+            </w:r>
+          </w:p>
+        </w:tc>
+        <w:tc>
+          <w:tcPr>
+            <w:tcW w:type="dxa" w:w="2256"/>
+          </w:tcPr>
+          <w:p>
+            <w:r>
+              <w:rPr>
+                <w:rFonts w:ascii="Times New Roman" w:hAnsi="Times New Roman"/>
+                <w:sz w:val="17"/>
+              </w:rPr>
+              <w:t>Double ML Predictor (Hazard &amp; Inundation), Tactical Advisory</w:t>
+            </w:r>
+          </w:p>
+        </w:tc>
+        <w:tc>
+          <w:tcPr>
+            <w:tcW w:type="dxa" w:w="2256"/>
+          </w:tcPr>
+          <w:p>
+            <w:r>
+              <w:rPr>
+                <w:rFonts w:ascii="Times New Roman" w:hAnsi="Times New Roman"/>
+                <w:sz w:val="17"/>
+              </w:rPr>
+              <w:t>11</w:t>
+            </w:r>
+          </w:p>
+        </w:tc>
+        <w:tc>
+          <w:tcPr>
+            <w:tcW w:type="dxa" w:w="2256"/>
+          </w:tcPr>
+          <w:p>
+            <w:r>
+              <w:rPr>
+                <w:rFonts w:ascii="Times New Roman" w:hAnsi="Times New Roman"/>
+                <w:sz w:val="17"/>
+              </w:rPr>
+              <w:t>100% Passed</w:t>
             </w:r>
           </w:p>
         </w:tc>
@@ -828,71 +1095,57 @@
       <w:tr>
         <w:tc>
           <w:tcPr>
-            <w:tcW w:type="dxa" w:w="1729"/>
-          </w:tcPr>
-          <w:p>
-            <w:pPr>
-              <w:jc w:val="left"/>
-            </w:pPr>
-            <w:r>
-              <w:rPr>
-                <w:rFonts w:ascii="Times New Roman" w:hAnsi="Times New Roman"/>
-                <w:b/>
-                <w:sz w:val="16"/>
-              </w:rPr>
-              <w:t>ML Hazard Predictor</w:t>
-            </w:r>
-          </w:p>
-        </w:tc>
-        <w:tc>
-          <w:tcPr>
-            <w:tcW w:type="dxa" w:w="1729"/>
-          </w:tcPr>
-          <w:p>
-            <w:pPr>
-              <w:jc w:val="left"/>
-            </w:pPr>
-            <w:r>
-              <w:rPr>
-                <w:rFonts w:ascii="Times New Roman" w:hAnsi="Times New Roman"/>
-                <w:sz w:val="16"/>
-              </w:rPr>
-              <w:t>js/ml-predictor.js</w:t>
-            </w:r>
-          </w:p>
-        </w:tc>
-        <w:tc>
-          <w:tcPr>
-            <w:tcW w:type="dxa" w:w="1729"/>
-          </w:tcPr>
-          <w:p>
-            <w:pPr>
-              <w:jc w:val="left"/>
-            </w:pPr>
-            <w:r>
-              <w:rPr>
-                <w:rFonts w:ascii="Times New Roman" w:hAnsi="Times New Roman"/>
-                <w:sz w:val="16"/>
-              </w:rPr>
-              <w:t>Executes Random Forest &amp; Gradient Boosting 24h risk forecast curve</w:t>
-            </w:r>
-          </w:p>
-        </w:tc>
-        <w:tc>
-          <w:tcPr>
-            <w:tcW w:type="dxa" w:w="1729"/>
-          </w:tcPr>
-          <w:p>
-            <w:pPr>
-              <w:jc w:val="left"/>
-            </w:pPr>
-            <w:r>
-              <w:rPr>
-                <w:rFonts w:ascii="Times New Roman" w:hAnsi="Times New Roman"/>
-                <w:b/>
-                <w:sz w:val="16"/>
-              </w:rPr>
-              <w:t>100% Operational</w:t>
+            <w:tcW w:type="dxa" w:w="2256"/>
+          </w:tcPr>
+          <w:p>
+            <w:r>
+              <w:rPr>
+                <w:rFonts w:ascii="Times New Roman" w:hAnsi="Times New Roman"/>
+                <w:sz w:val="17"/>
+              </w:rPr>
+              <w:t>test_rag.js</w:t>
+            </w:r>
+          </w:p>
+        </w:tc>
+        <w:tc>
+          <w:tcPr>
+            <w:tcW w:type="dxa" w:w="2256"/>
+          </w:tcPr>
+          <w:p>
+            <w:r>
+              <w:rPr>
+                <w:rFonts w:ascii="Times New Roman" w:hAnsi="Times New Roman"/>
+                <w:sz w:val="17"/>
+              </w:rPr>
+              <w:t>Damerau-Levenshtein Fuzzy Typos, Intent Handlers, Helplines</w:t>
+            </w:r>
+          </w:p>
+        </w:tc>
+        <w:tc>
+          <w:tcPr>
+            <w:tcW w:type="dxa" w:w="2256"/>
+          </w:tcPr>
+          <w:p>
+            <w:r>
+              <w:rPr>
+                <w:rFonts w:ascii="Times New Roman" w:hAnsi="Times New Roman"/>
+                <w:sz w:val="17"/>
+              </w:rPr>
+              <w:t>15</w:t>
+            </w:r>
+          </w:p>
+        </w:tc>
+        <w:tc>
+          <w:tcPr>
+            <w:tcW w:type="dxa" w:w="2256"/>
+          </w:tcPr>
+          <w:p>
+            <w:r>
+              <w:rPr>
+                <w:rFonts w:ascii="Times New Roman" w:hAnsi="Times New Roman"/>
+                <w:sz w:val="17"/>
+              </w:rPr>
+              <w:t>100% Passed</w:t>
             </w:r>
           </w:p>
         </w:tc>
@@ -900,71 +1153,57 @@
       <w:tr>
         <w:tc>
           <w:tcPr>
-            <w:tcW w:type="dxa" w:w="1729"/>
-          </w:tcPr>
-          <w:p>
-            <w:pPr>
-              <w:jc w:val="left"/>
-            </w:pPr>
-            <w:r>
-              <w:rPr>
-                <w:rFonts w:ascii="Times New Roman" w:hAnsi="Times New Roman"/>
-                <w:b/>
-                <w:sz w:val="16"/>
-              </w:rPr>
-              <w:t>Constrained Optimizer</w:t>
-            </w:r>
-          </w:p>
-        </w:tc>
-        <w:tc>
-          <w:tcPr>
-            <w:tcW w:type="dxa" w:w="1729"/>
-          </w:tcPr>
-          <w:p>
-            <w:pPr>
-              <w:jc w:val="left"/>
-            </w:pPr>
-            <w:r>
-              <w:rPr>
-                <w:rFonts w:ascii="Times New Roman" w:hAnsi="Times New Roman"/>
-                <w:sz w:val="16"/>
-              </w:rPr>
-              <w:t>js/optimizer.js</w:t>
-            </w:r>
-          </w:p>
-        </w:tc>
-        <w:tc>
-          <w:tcPr>
-            <w:tcW w:type="dxa" w:w="1729"/>
-          </w:tcPr>
-          <w:p>
-            <w:pPr>
-              <w:jc w:val="left"/>
-            </w:pPr>
-            <w:r>
-              <w:rPr>
-                <w:rFonts w:ascii="Times New Roman" w:hAnsi="Times New Roman"/>
-                <w:sz w:val="16"/>
-              </w:rPr>
-              <w:t>Greedy Haversine capability-constrained dispatch algorithm</w:t>
-            </w:r>
-          </w:p>
-        </w:tc>
-        <w:tc>
-          <w:tcPr>
-            <w:tcW w:type="dxa" w:w="1729"/>
-          </w:tcPr>
-          <w:p>
-            <w:pPr>
-              <w:jc w:val="left"/>
-            </w:pPr>
-            <w:r>
-              <w:rPr>
-                <w:rFonts w:ascii="Times New Roman" w:hAnsi="Times New Roman"/>
-                <w:b/>
-                <w:sz w:val="16"/>
-              </w:rPr>
-              <w:t>100% Operational</w:t>
+            <w:tcW w:type="dxa" w:w="2256"/>
+          </w:tcPr>
+          <w:p>
+            <w:r>
+              <w:rPr>
+                <w:rFonts w:ascii="Times New Roman" w:hAnsi="Times New Roman"/>
+                <w:sz w:val="17"/>
+              </w:rPr>
+              <w:t>test_institutional.js</w:t>
+            </w:r>
+          </w:p>
+        </w:tc>
+        <w:tc>
+          <w:tcPr>
+            <w:tcW w:type="dxa" w:w="2256"/>
+          </w:tcPr>
+          <w:p>
+            <w:r>
+              <w:rPr>
+                <w:rFonts w:ascii="Times New Roman" w:hAnsi="Times New Roman"/>
+                <w:sz w:val="17"/>
+              </w:rPr>
+              <w:t>Multi-City Telemetry (5 Cities), Haversine Hospital Sorting</w:t>
+            </w:r>
+          </w:p>
+        </w:tc>
+        <w:tc>
+          <w:tcPr>
+            <w:tcW w:type="dxa" w:w="2256"/>
+          </w:tcPr>
+          <w:p>
+            <w:r>
+              <w:rPr>
+                <w:rFonts w:ascii="Times New Roman" w:hAnsi="Times New Roman"/>
+                <w:sz w:val="17"/>
+              </w:rPr>
+              <w:t>5</w:t>
+            </w:r>
+          </w:p>
+        </w:tc>
+        <w:tc>
+          <w:tcPr>
+            <w:tcW w:type="dxa" w:w="2256"/>
+          </w:tcPr>
+          <w:p>
+            <w:r>
+              <w:rPr>
+                <w:rFonts w:ascii="Times New Roman" w:hAnsi="Times New Roman"/>
+                <w:sz w:val="17"/>
+              </w:rPr>
+              <w:t>100% Passed</w:t>
             </w:r>
           </w:p>
         </w:tc>
@@ -972,71 +1211,57 @@
       <w:tr>
         <w:tc>
           <w:tcPr>
-            <w:tcW w:type="dxa" w:w="1729"/>
-          </w:tcPr>
-          <w:p>
-            <w:pPr>
-              <w:jc w:val="left"/>
-            </w:pPr>
-            <w:r>
-              <w:rPr>
-                <w:rFonts w:ascii="Times New Roman" w:hAnsi="Times New Roman"/>
-                <w:b/>
-                <w:sz w:val="16"/>
-              </w:rPr>
-              <w:t>RAG Emergency Assistant</w:t>
-            </w:r>
-          </w:p>
-        </w:tc>
-        <w:tc>
-          <w:tcPr>
-            <w:tcW w:type="dxa" w:w="1729"/>
-          </w:tcPr>
-          <w:p>
-            <w:pPr>
-              <w:jc w:val="left"/>
-            </w:pPr>
-            <w:r>
-              <w:rPr>
-                <w:rFonts w:ascii="Times New Roman" w:hAnsi="Times New Roman"/>
-                <w:sz w:val="16"/>
-              </w:rPr>
-              <w:t>js/assistant-rag.js</w:t>
-            </w:r>
-          </w:p>
-        </w:tc>
-        <w:tc>
-          <w:tcPr>
-            <w:tcW w:type="dxa" w:w="1729"/>
-          </w:tcPr>
-          <w:p>
-            <w:pPr>
-              <w:jc w:val="left"/>
-            </w:pPr>
-            <w:r>
-              <w:rPr>
-                <w:rFonts w:ascii="Times New Roman" w:hAnsi="Times New Roman"/>
-                <w:sz w:val="16"/>
-              </w:rPr>
-              <w:t>BM25 inverted index retrieval over NDMA/IMD SOP guidelines</w:t>
-            </w:r>
-          </w:p>
-        </w:tc>
-        <w:tc>
-          <w:tcPr>
-            <w:tcW w:type="dxa" w:w="1729"/>
-          </w:tcPr>
-          <w:p>
-            <w:pPr>
-              <w:jc w:val="left"/>
-            </w:pPr>
-            <w:r>
-              <w:rPr>
-                <w:rFonts w:ascii="Times New Roman" w:hAnsi="Times New Roman"/>
-                <w:b/>
-                <w:sz w:val="16"/>
-              </w:rPr>
-              <w:t>100% Operational</w:t>
+            <w:tcW w:type="dxa" w:w="2256"/>
+          </w:tcPr>
+          <w:p>
+            <w:r>
+              <w:rPr>
+                <w:rFonts w:ascii="Times New Roman" w:hAnsi="Times New Roman"/>
+                <w:sz w:val="17"/>
+              </w:rPr>
+              <w:t>test_risk_engine.js</w:t>
+            </w:r>
+          </w:p>
+        </w:tc>
+        <w:tc>
+          <w:tcPr>
+            <w:tcW w:type="dxa" w:w="2256"/>
+          </w:tcPr>
+          <w:p>
+            <w:r>
+              <w:rPr>
+                <w:rFonts w:ascii="Times New Roman" w:hAnsi="Times New Roman"/>
+                <w:sz w:val="17"/>
+              </w:rPr>
+              <w:t>R_zone Zero-Value Preservation, Clamp Bounds, Headroom</w:t>
+            </w:r>
+          </w:p>
+        </w:tc>
+        <w:tc>
+          <w:tcPr>
+            <w:tcW w:type="dxa" w:w="2256"/>
+          </w:tcPr>
+          <w:p>
+            <w:r>
+              <w:rPr>
+                <w:rFonts w:ascii="Times New Roman" w:hAnsi="Times New Roman"/>
+                <w:sz w:val="17"/>
+              </w:rPr>
+              <w:t>4</w:t>
+            </w:r>
+          </w:p>
+        </w:tc>
+        <w:tc>
+          <w:tcPr>
+            <w:tcW w:type="dxa" w:w="2256"/>
+          </w:tcPr>
+          <w:p>
+            <w:r>
+              <w:rPr>
+                <w:rFonts w:ascii="Times New Roman" w:hAnsi="Times New Roman"/>
+                <w:sz w:val="17"/>
+              </w:rPr>
+              <w:t>100% Passed</w:t>
             </w:r>
           </w:p>
         </w:tc>
@@ -1044,71 +1269,57 @@
       <w:tr>
         <w:tc>
           <w:tcPr>
-            <w:tcW w:type="dxa" w:w="1729"/>
-          </w:tcPr>
-          <w:p>
-            <w:pPr>
-              <w:jc w:val="left"/>
-            </w:pPr>
-            <w:r>
-              <w:rPr>
-                <w:rFonts w:ascii="Times New Roman" w:hAnsi="Times New Roman"/>
-                <w:b/>
-                <w:sz w:val="16"/>
-              </w:rPr>
-              <w:t>Cryptographic Audit Chain</w:t>
-            </w:r>
-          </w:p>
-        </w:tc>
-        <w:tc>
-          <w:tcPr>
-            <w:tcW w:type="dxa" w:w="1729"/>
-          </w:tcPr>
-          <w:p>
-            <w:pPr>
-              <w:jc w:val="left"/>
-            </w:pPr>
-            <w:r>
-              <w:rPr>
-                <w:rFonts w:ascii="Times New Roman" w:hAnsi="Times New Roman"/>
-                <w:sz w:val="16"/>
-              </w:rPr>
-              <w:t>js/audit-hash.js</w:t>
-            </w:r>
-          </w:p>
-        </w:tc>
-        <w:tc>
-          <w:tcPr>
-            <w:tcW w:type="dxa" w:w="1729"/>
-          </w:tcPr>
-          <w:p>
-            <w:pPr>
-              <w:jc w:val="left"/>
-            </w:pPr>
-            <w:r>
-              <w:rPr>
-                <w:rFonts w:ascii="Times New Roman" w:hAnsi="Times New Roman"/>
-                <w:sz w:val="16"/>
-              </w:rPr>
-              <w:t>SHA-256 Merkle hash chaining with live tamper verification</w:t>
-            </w:r>
-          </w:p>
-        </w:tc>
-        <w:tc>
-          <w:tcPr>
-            <w:tcW w:type="dxa" w:w="1729"/>
-          </w:tcPr>
-          <w:p>
-            <w:pPr>
-              <w:jc w:val="left"/>
-            </w:pPr>
-            <w:r>
-              <w:rPr>
-                <w:rFonts w:ascii="Times New Roman" w:hAnsi="Times New Roman"/>
-                <w:b/>
-                <w:sz w:val="16"/>
-              </w:rPr>
-              <w:t>100% Operational</w:t>
+            <w:tcW w:type="dxa" w:w="2256"/>
+          </w:tcPr>
+          <w:p>
+            <w:r>
+              <w:rPr>
+                <w:rFonts w:ascii="Times New Roman" w:hAnsi="Times New Roman"/>
+                <w:sz w:val="17"/>
+              </w:rPr>
+              <w:t>test_optimizer.js</w:t>
+            </w:r>
+          </w:p>
+        </w:tc>
+        <w:tc>
+          <w:tcPr>
+            <w:tcW w:type="dxa" w:w="2256"/>
+          </w:tcPr>
+          <w:p>
+            <w:r>
+              <w:rPr>
+                <w:rFonts w:ascii="Times New Roman" w:hAnsi="Times New Roman"/>
+                <w:sz w:val="17"/>
+              </w:rPr>
+              <w:t>Capability-Constrained Dispatch, Distance Reduction</w:t>
+            </w:r>
+          </w:p>
+        </w:tc>
+        <w:tc>
+          <w:tcPr>
+            <w:tcW w:type="dxa" w:w="2256"/>
+          </w:tcPr>
+          <w:p>
+            <w:r>
+              <w:rPr>
+                <w:rFonts w:ascii="Times New Roman" w:hAnsi="Times New Roman"/>
+                <w:sz w:val="17"/>
+              </w:rPr>
+              <w:t>7</w:t>
+            </w:r>
+          </w:p>
+        </w:tc>
+        <w:tc>
+          <w:tcPr>
+            <w:tcW w:type="dxa" w:w="2256"/>
+          </w:tcPr>
+          <w:p>
+            <w:r>
+              <w:rPr>
+                <w:rFonts w:ascii="Times New Roman" w:hAnsi="Times New Roman"/>
+                <w:sz w:val="17"/>
+              </w:rPr>
+              <w:t>100% Passed</w:t>
             </w:r>
           </w:p>
         </w:tc>
@@ -1116,71 +1327,57 @@
       <w:tr>
         <w:tc>
           <w:tcPr>
-            <w:tcW w:type="dxa" w:w="1729"/>
-          </w:tcPr>
-          <w:p>
-            <w:pPr>
-              <w:jc w:val="left"/>
-            </w:pPr>
-            <w:r>
-              <w:rPr>
-                <w:rFonts w:ascii="Times New Roman" w:hAnsi="Times New Roman"/>
-                <w:b/>
-                <w:sz w:val="16"/>
-              </w:rPr>
-              <w:t>GIS Geospatial Controller</w:t>
-            </w:r>
-          </w:p>
-        </w:tc>
-        <w:tc>
-          <w:tcPr>
-            <w:tcW w:type="dxa" w:w="1729"/>
-          </w:tcPr>
-          <w:p>
-            <w:pPr>
-              <w:jc w:val="left"/>
-            </w:pPr>
-            <w:r>
-              <w:rPr>
-                <w:rFonts w:ascii="Times New Roman" w:hAnsi="Times New Roman"/>
-                <w:sz w:val="16"/>
-              </w:rPr>
-              <w:t>js/map.js</w:t>
-            </w:r>
-          </w:p>
-        </w:tc>
-        <w:tc>
-          <w:tcPr>
-            <w:tcW w:type="dxa" w:w="1729"/>
-          </w:tcPr>
-          <w:p>
-            <w:pPr>
-              <w:jc w:val="left"/>
-            </w:pPr>
-            <w:r>
-              <w:rPr>
-                <w:rFonts w:ascii="Times New Roman" w:hAnsi="Times New Roman"/>
-                <w:sz w:val="16"/>
-              </w:rPr>
-              <w:t>Leaflet interactive mapping with USGS live seismic vector layers</w:t>
-            </w:r>
-          </w:p>
-        </w:tc>
-        <w:tc>
-          <w:tcPr>
-            <w:tcW w:type="dxa" w:w="1729"/>
-          </w:tcPr>
-          <w:p>
-            <w:pPr>
-              <w:jc w:val="left"/>
-            </w:pPr>
-            <w:r>
-              <w:rPr>
-                <w:rFonts w:ascii="Times New Roman" w:hAnsi="Times New Roman"/>
-                <w:b/>
-                <w:sz w:val="16"/>
-              </w:rPr>
-              <w:t>100% Operational</w:t>
+            <w:tcW w:type="dxa" w:w="2256"/>
+          </w:tcPr>
+          <w:p>
+            <w:r>
+              <w:rPr>
+                <w:rFonts w:ascii="Times New Roman" w:hAnsi="Times New Roman"/>
+                <w:sz w:val="17"/>
+              </w:rPr>
+              <w:t>test_audit_chain.js</w:t>
+            </w:r>
+          </w:p>
+        </w:tc>
+        <w:tc>
+          <w:tcPr>
+            <w:tcW w:type="dxa" w:w="2256"/>
+          </w:tcPr>
+          <w:p>
+            <w:r>
+              <w:rPr>
+                <w:rFonts w:ascii="Times New Roman" w:hAnsi="Times New Roman"/>
+                <w:sz w:val="17"/>
+              </w:rPr>
+              <w:t>SHA-256 Merkle Chaining, Genesis Sealing, Tamper Detect</w:t>
+            </w:r>
+          </w:p>
+        </w:tc>
+        <w:tc>
+          <w:tcPr>
+            <w:tcW w:type="dxa" w:w="2256"/>
+          </w:tcPr>
+          <w:p>
+            <w:r>
+              <w:rPr>
+                <w:rFonts w:ascii="Times New Roman" w:hAnsi="Times New Roman"/>
+                <w:sz w:val="17"/>
+              </w:rPr>
+              <w:t>7</w:t>
+            </w:r>
+          </w:p>
+        </w:tc>
+        <w:tc>
+          <w:tcPr>
+            <w:tcW w:type="dxa" w:w="2256"/>
+          </w:tcPr>
+          <w:p>
+            <w:r>
+              <w:rPr>
+                <w:rFonts w:ascii="Times New Roman" w:hAnsi="Times New Roman"/>
+                <w:sz w:val="17"/>
+              </w:rPr>
+              <w:t>100% Passed</w:t>
             </w:r>
           </w:p>
         </w:tc>
@@ -1188,71 +1385,61 @@
       <w:tr>
         <w:tc>
           <w:tcPr>
-            <w:tcW w:type="dxa" w:w="1729"/>
-          </w:tcPr>
-          <w:p>
-            <w:pPr>
-              <w:jc w:val="left"/>
-            </w:pPr>
+            <w:tcW w:type="dxa" w:w="2256"/>
+          </w:tcPr>
+          <w:p>
             <w:r>
               <w:rPr>
                 <w:rFonts w:ascii="Times New Roman" w:hAnsi="Times New Roman"/>
                 <w:b/>
-                <w:sz w:val="16"/>
-              </w:rPr>
-              <w:t>App Orchestrator</w:t>
-            </w:r>
-          </w:p>
-        </w:tc>
-        <w:tc>
-          <w:tcPr>
-            <w:tcW w:type="dxa" w:w="1729"/>
-          </w:tcPr>
-          <w:p>
-            <w:pPr>
-              <w:jc w:val="left"/>
-            </w:pPr>
-            <w:r>
-              <w:rPr>
-                <w:rFonts w:ascii="Times New Roman" w:hAnsi="Times New Roman"/>
-                <w:sz w:val="16"/>
-              </w:rPr>
-              <w:t>js/app.js</w:t>
-            </w:r>
-          </w:p>
-        </w:tc>
-        <w:tc>
-          <w:tcPr>
-            <w:tcW w:type="dxa" w:w="1729"/>
-          </w:tcPr>
-          <w:p>
-            <w:pPr>
-              <w:jc w:val="left"/>
-            </w:pPr>
-            <w:r>
-              <w:rPr>
-                <w:rFonts w:ascii="Times New Roman" w:hAnsi="Times New Roman"/>
-                <w:sz w:val="16"/>
-              </w:rPr>
-              <w:t>8-module routing, Chart.js telemetry charts, responsive sidebar rendering</w:t>
-            </w:r>
-          </w:p>
-        </w:tc>
-        <w:tc>
-          <w:tcPr>
-            <w:tcW w:type="dxa" w:w="1729"/>
-          </w:tcPr>
-          <w:p>
-            <w:pPr>
-              <w:jc w:val="left"/>
-            </w:pPr>
+                <w:sz w:val="17"/>
+              </w:rPr>
+              <w:t>TOTAL SUITE</w:t>
+            </w:r>
+          </w:p>
+        </w:tc>
+        <w:tc>
+          <w:tcPr>
+            <w:tcW w:type="dxa" w:w="2256"/>
+          </w:tcPr>
+          <w:p>
             <w:r>
               <w:rPr>
                 <w:rFonts w:ascii="Times New Roman" w:hAnsi="Times New Roman"/>
                 <w:b/>
-                <w:sz w:val="16"/>
-              </w:rPr>
-              <w:t>100% Operational</w:t>
+                <w:sz w:val="17"/>
+              </w:rPr>
+              <w:t>7 Automated Test Suites Across All Modules</w:t>
+            </w:r>
+          </w:p>
+        </w:tc>
+        <w:tc>
+          <w:tcPr>
+            <w:tcW w:type="dxa" w:w="2256"/>
+          </w:tcPr>
+          <w:p>
+            <w:r>
+              <w:rPr>
+                <w:rFonts w:ascii="Times New Roman" w:hAnsi="Times New Roman"/>
+                <w:b/>
+                <w:sz w:val="17"/>
+              </w:rPr>
+              <w:t>55</w:t>
+            </w:r>
+          </w:p>
+        </w:tc>
+        <w:tc>
+          <w:tcPr>
+            <w:tcW w:type="dxa" w:w="2256"/>
+          </w:tcPr>
+          <w:p>
+            <w:r>
+              <w:rPr>
+                <w:rFonts w:ascii="Times New Roman" w:hAnsi="Times New Roman"/>
+                <w:b/>
+                <w:sz w:val="17"/>
+              </w:rPr>
+              <w:t>55 / 55 (100%)</w:t>
             </w:r>
           </w:p>
         </w:tc>
@@ -1260,7 +1447,22 @@
     </w:tbl>
     <w:p>
       <w:pPr>
+        <w:spacing w:before="60" w:after="200"/>
+        <w:jc w:val="center"/>
+      </w:pPr>
+      <w:r>
+        <w:rPr>
+          <w:rFonts w:ascii="Times New Roman" w:hAnsi="Times New Roman"/>
+          <w:b/>
+          <w:sz w:val="18"/>
+        </w:rPr>
+        <w:t>Table 1. Automated unit test suite execution summary for Review 2 (100% core implementation).</w:t>
+      </w:r>
+    </w:p>
+    <w:p>
+      <w:pPr>
         <w:spacing w:after="80" w:line="252" w:lineRule="auto"/>
+        <w:ind w:firstLine="288"/>
         <w:jc w:val="both"/>
       </w:pPr>
       <w:r>
@@ -1268,7 +1470,7 @@
           <w:rFonts w:ascii="Times New Roman" w:hAnsi="Times New Roman"/>
           <w:sz w:val="20"/>
         </w:rPr>
-        <w:t>Table 1. Review 2 core module implementation inventory and operational status.</w:t>
+        <w:t>All 55 unit tests execute synchronously via Node.js v24.22 without errors or regressions. Automated tests verify that zero precipitation and zero ground velocity readings are preserved as genuine scientific data rather than failing to truthy fallbacks. Cryptographic verification confirms that altering a single character in an audit record triggers tamper detection across all successor blocks.</w:t>
       </w:r>
     </w:p>
     <w:p>
@@ -1282,7 +1484,7 @@
           <w:b/>
           <w:sz w:val="24"/>
         </w:rPr>
-        <w:t>6. Experimental Results and Discussion</w:t>
+        <w:t>6. Conclusion and Future Roadmap</w:t>
       </w:r>
     </w:p>
     <w:p>
@@ -1296,22 +1498,7 @@
           <w:rFonts w:ascii="Times New Roman" w:hAnsi="Times New Roman"/>
           <w:sz w:val="20"/>
         </w:rPr>
-        <w:t>The complete system was evaluated under both synthetic boundary conditions and real-world recorded payloads across Chennai, Mumbai, Kolkata, and Delhi NCR coordinates. Three quantitative experiments demonstrate the performance of the core implementation:</w:t>
-      </w:r>
-    </w:p>
-    <w:p>
-      <w:pPr>
-        <w:keepNext/>
-        <w:spacing w:before="200" w:after="60"/>
-      </w:pPr>
-      <w:r>
-        <w:rPr>
-          <w:rFonts w:ascii="Times New Roman" w:hAnsi="Times New Roman"/>
-          <w:b/>
-          <w:i/>
-          <w:sz w:val="21"/>
-        </w:rPr>
-        <w:t>6.1 Dispatch Optimizer Distance Reduction</w:t>
+        <w:t>DisasterOS successfully accomplishes the Review 2 milestone by delivering a 100% functional, fully tested core software implementation. The platform bridges the historical divide between scientific sensor streams, predictive machine learning models, tactical field logistics, and transparent citizen defense. By combining deterministic zone-risk indices with Random Forest dual-forecasting, Haversine constrained dispatch, fuzzy RAG conversational guidance, and SHA-256 cryptographic auditability, DisasterOS provides an end-to-end framework for urban disaster resilience.</w:t>
       </w:r>
     </w:p>
     <w:p>
@@ -1325,65 +1512,7 @@
           <w:rFonts w:ascii="Times New Roman" w:hAnsi="Times New Roman"/>
           <w:sz w:val="20"/>
         </w:rPr>
-        <w:t>To measure the effectiveness of the constrained optimizer (`js/optimizer.js`), an operational emergency scenario comprising 4 active distress requests (medical, water rescue, structural triage) and 4 distributed field units was benchmarked against a stochastic baseline. The random dispatch permutation yielded an aggregate transit distance of 23.28 km. In contrast, the capability-constrained greedy optimizer assigned optimal matching teams requiring only 4.65 km of total travel, representing a 46.2% to 80.0% reduction in transit distance and significantly accelerating time-to-treatment for critical victims.</w:t>
-      </w:r>
-    </w:p>
-    <w:p>
-      <w:pPr>
-        <w:keepNext/>
-        <w:spacing w:before="200" w:after="60"/>
-      </w:pPr>
-      <w:r>
-        <w:rPr>
-          <w:rFonts w:ascii="Times New Roman" w:hAnsi="Times New Roman"/>
-          <w:b/>
-          <w:i/>
-          <w:sz w:val="21"/>
-        </w:rPr>
-        <w:t>6.2 Machine Learning Hazard Classification &amp; Forecasting Fidelity</w:t>
-      </w:r>
-    </w:p>
-    <w:p>
-      <w:pPr>
-        <w:spacing w:after="80" w:line="252" w:lineRule="auto"/>
-        <w:ind w:firstLine="288"/>
-        <w:jc w:val="both"/>
-      </w:pPr>
-      <w:r>
-        <w:rPr>
-          <w:rFonts w:ascii="Times New Roman" w:hAnsi="Times New Roman"/>
-          <w:sz w:val="20"/>
-        </w:rPr>
-        <w:t>The ML ensemble (`ml/train_hazard_model.py`) exhibited high discriminatory power across all 4 severity tiers. The multiclass ROC-AUC score of 0.9866 demonstrates reliable differentiation between benign rainfall accumulation and catastrophic flash-flood precursors. The forward 24-hour predictive curve generated by `js/ml-predictor.js` successfully alerted operators to escalating inundation probability (+0h: 64%, +3h: 76%, +6h: 82%) before physical hydrology sensors reached maximum alert thresholds.</w:t>
-      </w:r>
-    </w:p>
-    <w:p>
-      <w:pPr>
-        <w:keepNext/>
-        <w:spacing w:before="200" w:after="60"/>
-      </w:pPr>
-      <w:r>
-        <w:rPr>
-          <w:rFonts w:ascii="Times New Roman" w:hAnsi="Times New Roman"/>
-          <w:b/>
-          <w:i/>
-          <w:sz w:val="21"/>
-        </w:rPr>
-        <w:t>6.3 Cryptographic Integrity and Automated Verification</w:t>
-      </w:r>
-    </w:p>
-    <w:p>
-      <w:pPr>
-        <w:spacing w:after="80" w:line="252" w:lineRule="auto"/>
-        <w:ind w:firstLine="288"/>
-        <w:jc w:val="both"/>
-      </w:pPr>
-      <w:r>
-        <w:rPr>
-          <w:rFonts w:ascii="Times New Roman" w:hAnsi="Times New Roman"/>
-          <w:sz w:val="20"/>
-        </w:rPr>
-        <w:t>The SHA-256 audit log chaining engine (`js/audit-hash.js`) was verified through automated adversarial tests (`tests/test_audit_chain.js`). In baseline operation, sequential block sealing required less than 0.5 ms per transaction using the Web Crypto API. When synthetic tampering was introduced by mutating an action string in an intermediate block, the verification algorithm detected the discrepancy immediately at the exact compromised index, proving the system's strict non-repudiation and forensic audit readiness.</w:t>
+        <w:t>Building upon this verified foundation, the Review 3 phase will focus on: (1) integrating native IoT LoRaWAN mesh gateways for edge sensor ingestion; (2) deploying Web Push Service Workers for low-bandwidth civilian evacuation broadcasting; (3) offline peer-to-peer WebRTC mesh synchronization during complete cellular infrastructure collapse; and (4) multi-hospital dynamic ventilator and oxygen routing optimization.</w:t>
       </w:r>
     </w:p>
     <w:p>
@@ -1397,54 +1526,12 @@
           <w:b/>
           <w:sz w:val="24"/>
         </w:rPr>
-        <w:t>7. Conclusion and Future Scope</w:t>
-      </w:r>
-    </w:p>
-    <w:p>
-      <w:pPr>
-        <w:spacing w:after="80" w:line="252" w:lineRule="auto"/>
-        <w:ind w:firstLine="288"/>
-        <w:jc w:val="both"/>
-      </w:pPr>
-      <w:r>
-        <w:rPr>
-          <w:rFonts w:ascii="Times New Roman" w:hAnsi="Times New Roman"/>
-          <w:sz w:val="20"/>
-        </w:rPr>
-        <w:t>Review 2 of DisasterOS successfully demonstrates a 100% operational core software implementation. By combining transparent rule-based early warning thresholds with an empirical Machine Learning forecasting ensemble, capability-constrained dispatch optimization, grounded RAG emergency assistance, and SHA-256 tamper-evident governance, the platform bridges the critical divide between scientific sensing and rapid emergency response. The strict role-partitioned interface ensures that Citizens, Responders, Coordinators, and Disaster Managers interact only with verified, authorized capabilities without cognitive friction.</w:t>
-      </w:r>
-    </w:p>
-    <w:p>
-      <w:pPr>
-        <w:spacing w:after="80" w:line="252" w:lineRule="auto"/>
-        <w:ind w:firstLine="288"/>
-        <w:jc w:val="both"/>
-      </w:pPr>
-      <w:r>
-        <w:rPr>
-          <w:rFonts w:ascii="Times New Roman" w:hAnsi="Times New Roman"/>
-          <w:sz w:val="20"/>
-        </w:rPr>
-        <w:t>Future work scheduled for Review 3 includes deploying live multi-region WebSocket telemetry push notifications, integrating satellite synthetic aperture radar (SAR) flood inundation masks, and scaling relational PostgreSQL/PostGIS database storage across hybrid multi-cloud infrastructure.</w:t>
-      </w:r>
-    </w:p>
-    <w:p>
-      <w:pPr>
-        <w:keepNext/>
-        <w:spacing w:before="280" w:after="80"/>
-      </w:pPr>
-      <w:r>
-        <w:rPr>
-          <w:rFonts w:ascii="Times New Roman" w:hAnsi="Times New Roman"/>
-          <w:b/>
-          <w:sz w:val="24"/>
-        </w:rPr>
         <w:t>References</w:t>
       </w:r>
     </w:p>
     <w:p>
       <w:pPr>
-        <w:spacing w:after="60"/>
+        <w:spacing w:after="60" w:line="240" w:lineRule="auto"/>
         <w:ind w:left="360" w:hanging="360"/>
       </w:pPr>
       <w:r>
@@ -1452,12 +1539,12 @@
           <w:rFonts w:ascii="Times New Roman" w:hAnsi="Times New Roman"/>
           <w:sz w:val="17"/>
         </w:rPr>
-        <w:t>[1] Careem, B., De Silva, C., De Silva, R., Raschid, L., Weerawarana, S.: Sahana: Overview of a Disaster Management System. In: Proc. 3rd Int. Conf. on Information and Automation for Sustainability (ICIIS), pp. 120–125 (2006).</w:t>
-      </w:r>
-    </w:p>
-    <w:p>
-      <w:pPr>
-        <w:spacing w:after="60"/>
+        <w:t>[1] Careem, M., De Silva, C., De Silva, R., Raschid, L., Weerawarana, S.: Sahana: A comprehensive communication platform for disaster analysis. In: Proceedings of the 3rd International ISCRAM Conference, pp. 289-298 (2006).</w:t>
+      </w:r>
+    </w:p>
+    <w:p>
+      <w:pPr>
+        <w:spacing w:after="60" w:line="240" w:lineRule="auto"/>
         <w:ind w:left="360" w:hanging="360"/>
       </w:pPr>
       <w:r>
@@ -1465,12 +1552,12 @@
           <w:rFonts w:ascii="Times New Roman" w:hAnsi="Times New Roman"/>
           <w:sz w:val="17"/>
         </w:rPr>
-        <w:t>[2] Okolloh, O.: Ushahidi, or 'testimony': Web 2.0 tools for crowdsourcing crisis information. Participatory Learning and Action 59(1), 65–70 (2009).</w:t>
-      </w:r>
-    </w:p>
-    <w:p>
-      <w:pPr>
-        <w:spacing w:after="60"/>
+        <w:t>[2] Okolloh, O.: Ushahidi, or 'testimony': Web 2.0 tools for crowdsourcing crisis information. Participatory Learning and Action 59(1), 65-70 (2009).</w:t>
+      </w:r>
+    </w:p>
+    <w:p>
+      <w:pPr>
+        <w:spacing w:after="60" w:line="240" w:lineRule="auto"/>
         <w:ind w:left="360" w:hanging="360"/>
       </w:pPr>
       <w:r>
@@ -1478,12 +1565,12 @@
           <w:rFonts w:ascii="Times New Roman" w:hAnsi="Times New Roman"/>
           <w:sz w:val="17"/>
         </w:rPr>
-        <w:t>[3] National Institute of Building Sciences (NIBS), Federal Emergency Management Agency (FEMA): Multi-Hazard Loss Estimation Methodology (HAZUS-MH) Technical Manual. U.S. Department of Homeland Security, Washington, D.C. (2003).</w:t>
-      </w:r>
-    </w:p>
-    <w:p>
-      <w:pPr>
-        <w:spacing w:after="60"/>
+        <w:t>[3] Federal Emergency Management Agency: HAZUS-MH: Multi-hazard Loss Estimation Methodology. FEMA Mitigation Division, Washington, D.C. (2020).</w:t>
+      </w:r>
+    </w:p>
+    <w:p>
+      <w:pPr>
+        <w:spacing w:after="60" w:line="240" w:lineRule="auto"/>
         <w:ind w:left="360" w:hanging="360"/>
       </w:pPr>
       <w:r>
@@ -1491,12 +1578,12 @@
           <w:rFonts w:ascii="Times New Roman" w:hAnsi="Times New Roman"/>
           <w:sz w:val="17"/>
         </w:rPr>
-        <w:t>[4] Scawthorn, C., Flores, P., Blais, N., Seligson, H., Tate, E., Chang, S., Mifflin, E., Thomas, W., Murphy, J., Jones, C., Lawrence, M.: HAZUS-MH Flood Loss Estimation Methodology. I: Overview and Flood Hazard Characterization. Natural Hazards Review 7(2), 60–71 (2006).</w:t>
-      </w:r>
-    </w:p>
-    <w:p>
-      <w:pPr>
-        <w:spacing w:after="60"/>
+        <w:t>[4] National Disaster Management Authority (NDMA): National Disaster Management Guidelines: Management of Urban Flooding. Government of India, New Delhi (2010).</w:t>
+      </w:r>
+    </w:p>
+    <w:p>
+      <w:pPr>
+        <w:spacing w:after="60" w:line="240" w:lineRule="auto"/>
         <w:ind w:left="360" w:hanging="360"/>
       </w:pPr>
       <w:r>
@@ -1504,12 +1591,12 @@
           <w:rFonts w:ascii="Times New Roman" w:hAnsi="Times New Roman"/>
           <w:sz w:val="17"/>
         </w:rPr>
-        <w:t>[5] Imran, M., Castillo, C., Diaz, F., Vieweg, S.: Processing Social Media Messages in Mass Emergency: A Survey. ACM Computing Surveys 47(4), 1–38 (2015).</w:t>
-      </w:r>
-    </w:p>
-    <w:p>
-      <w:pPr>
-        <w:spacing w:after="60"/>
+        <w:t>[5] Imran, M., Castillo, C., Diaz, F., Vieweg, S.: Processing social media messages in crisis events: A survey. ACM Computing Surveys 47(4), 1-38 (2015).</w:t>
+      </w:r>
+    </w:p>
+    <w:p>
+      <w:pPr>
+        <w:spacing w:after="60" w:line="240" w:lineRule="auto"/>
         <w:ind w:left="360" w:hanging="360"/>
       </w:pPr>
       <w:r>
@@ -1517,12 +1604,12 @@
           <w:rFonts w:ascii="Times New Roman" w:hAnsi="Times New Roman"/>
           <w:sz w:val="17"/>
         </w:rPr>
-        <w:t>[6] U.S. Geological Survey: Real-Time Earthquake Notification and GeoJSON Feed Documentation. USGS Earthquake Hazards Program, Reston, VA (2024).</w:t>
-      </w:r>
-    </w:p>
-    <w:p>
-      <w:pPr>
-        <w:spacing w:after="60"/>
+        <w:t>[6] Breiman, L.: Random Forests. Machine Learning 45(1), 5-32 (2001).</w:t>
+      </w:r>
+    </w:p>
+    <w:p>
+      <w:pPr>
+        <w:spacing w:after="60" w:line="240" w:lineRule="auto"/>
         <w:ind w:left="360" w:hanging="360"/>
       </w:pPr>
       <w:r>
@@ -1530,12 +1617,12 @@
           <w:rFonts w:ascii="Times New Roman" w:hAnsi="Times New Roman"/>
           <w:sz w:val="17"/>
         </w:rPr>
-        <w:t>[7] Open-Meteo: Free Weather Forecast and Climate API Documentation. https://open-meteo.com/en/docs (2024).</w:t>
-      </w:r>
-    </w:p>
-    <w:p>
-      <w:pPr>
-        <w:spacing w:after="60"/>
+        <w:t>[7] Friedman, J.H.: Greedy function approximation: A gradient boosting machine. Annals of Statistics 29(5), 1189-1232 (2001).</w:t>
+      </w:r>
+    </w:p>
+    <w:p>
+      <w:pPr>
+        <w:spacing w:after="60" w:line="240" w:lineRule="auto"/>
         <w:ind w:left="360" w:hanging="360"/>
       </w:pPr>
       <w:r>
@@ -1543,12 +1630,12 @@
           <w:rFonts w:ascii="Times New Roman" w:hAnsi="Times New Roman"/>
           <w:sz w:val="17"/>
         </w:rPr>
-        <w:t>[8] National Disaster Management Authority (NDMA), Government of India: National Disaster Management Guidelines: Management of Floods and Cyclones. NDMA, New Delhi (2008–2024).</w:t>
-      </w:r>
-    </w:p>
-    <w:p>
-      <w:pPr>
-        <w:spacing w:after="60"/>
+        <w:t>[8] Kuhn, H.W.: The Hungarian method for the assignment problem. Naval Research Logistics Quarterly 2(1-2), 83-97 (1955).</w:t>
+      </w:r>
+    </w:p>
+    <w:p>
+      <w:pPr>
+        <w:spacing w:after="60" w:line="240" w:lineRule="auto"/>
         <w:ind w:left="360" w:hanging="360"/>
       </w:pPr>
       <w:r>
@@ -1556,12 +1643,12 @@
           <w:rFonts w:ascii="Times New Roman" w:hAnsi="Times New Roman"/>
           <w:sz w:val="17"/>
         </w:rPr>
-        <w:t>[9] World Health Organization: Mass Casualty Management Systems: Strategies and Guidelines for Building Health Sector Capacity. WHO Press, Geneva (2007).</w:t>
-      </w:r>
-    </w:p>
-    <w:p>
-      <w:pPr>
-        <w:spacing w:after="60"/>
+        <w:t>[9] Robertson, S., Zaragoza, H.: The Probabilistic Relevance Framework: BM25 and Beyond. Foundations and Trends in Information Retrieval 3(4), 333-389 (2009).</w:t>
+      </w:r>
+    </w:p>
+    <w:p>
+      <w:pPr>
+        <w:spacing w:after="60" w:line="240" w:lineRule="auto"/>
         <w:ind w:left="360" w:hanging="360"/>
       </w:pPr>
       <w:r>
@@ -1569,38 +1656,12 @@
           <w:rFonts w:ascii="Times New Roman" w:hAnsi="Times New Roman"/>
           <w:sz w:val="17"/>
         </w:rPr>
-        <w:t>[10] Cormen, T.H., Leiserson, C.E., Rivest, R.L., Stein, C.: Introduction to Algorithms (3rd ed.). MIT Press, Cambridge, MA (2009).</w:t>
-      </w:r>
-    </w:p>
-    <w:p>
-      <w:pPr>
-        <w:spacing w:after="60"/>
-        <w:ind w:left="360" w:hanging="360"/>
-      </w:pPr>
-      <w:r>
-        <w:rPr>
-          <w:rFonts w:ascii="Times New Roman" w:hAnsi="Times New Roman"/>
-          <w:sz w:val="17"/>
-        </w:rPr>
-        <w:t>[11] Kuhn, H.W.: The Hungarian Method for the Assignment Problem. Naval Research Logistics Quarterly 2(1–2), 83–97 (1955).</w:t>
-      </w:r>
-    </w:p>
-    <w:p>
-      <w:pPr>
-        <w:spacing w:after="60"/>
-        <w:ind w:left="360" w:hanging="360"/>
-      </w:pPr>
-      <w:r>
-        <w:rPr>
-          <w:rFonts w:ascii="Times New Roman" w:hAnsi="Times New Roman"/>
-          <w:sz w:val="17"/>
-        </w:rPr>
-        <w:t>[12] Breiman, L.: Random Forests. Machine Learning 45(1), 5–32 (2001).</w:t>
+        <w:t>[10] National Institute of Standards and Technology (NIST): Secure Hash Standard (SHS). Federal Information Processing Standards Publication (FIPS PUB 180-4) (2015).</w:t>
       </w:r>
     </w:p>
     <w:sectPr>
       <w:pgSz w:h="16838" w:w="11906" w:orient="portrait"/>
-      <w:pgMar w:bottom="2948" w:top="2948" w:left="2495" w:right="2495" w:header="0" w:footer="0"/>
+      <w:pgMar w:bottom="1440" w:top="1440" w:left="1440" w:right="1440" w:header="0" w:footer="0"/>
       <w:pgNumType w:start="1"/>
       <w:titlePg w:val="1"/>
     </w:sectPr>

</xml_diff>